<commit_message>
Ajusta falas dos vídeos 2 e 3 e adiciona legendas dos posts de Instagram (vídeos 2 e 4)
Co-Authored-By: Claude Sonnet 5 <noreply@anthropic.com>
Claude-Session: https://claude.ai/code/session_01GQSqEjEuqv44iBdACeUWUZ
</commit_message>
<xml_diff>
--- a/eleva/roteiro-videos-hub-eleva-hub-negocios.docx
+++ b/eleva/roteiro-videos-hub-eleva-hub-negocios.docx
@@ -252,67 +252,7 @@
           <w:sz w:val="21"/>
           <w:szCs w:val="21"/>
         </w:rPr>
-        <w:t xml:space="preserve">"Olá, pessoal! Sou o Giuliano Spolavori, fundador da Eleva. Estou passando aqui para te fazer um convite. Se você é síndico e ainda não faz parte do nosso Hub Eleva, Síndicos de Alta Performance, lá no WhatsApp, você está perdendo tempo. É uma comunidade totalmente gratuita. E nos próximos dias, por lá, vou liberar acesso, só para quem faz parte do grupo, a um portal que estamos desenvolvendo, com muito conteúdo de valor que vai facilitar a sua vida no seu dia a dia de síndico. Porque eu sei que é uma rotina corrida. Então, ali vai centralizar várias informações que vão te auxiliar na sua gestão, para você conseguir entregar cada vez mais valor para a sua carteira de condomínios. Se você se interessou, entre no nosso Hub Eleva através do link da bio."</w:t>
-      </w:r>
-    </w:p>
-    <w:p>
-      <w:pPr>
-        <w:pBdr>
-          <w:bottom w:val="single" w:color="cccccc" w:sz="6" w:space="4"/>
-        </w:pBdr>
-        <w:spacing w:after="200"/>
-      </w:pPr>
-    </w:p>
-    <w:p>
-      <w:pPr>
-        <w:pStyle w:val="Heading2"/>
-        <w:keepNext/>
-        <w:spacing w:after="150" w:before="300"/>
-      </w:pPr>
-      <w:r>
-        <w:t xml:space="preserve">Vídeo 3 — Pergunta para o Hub Eleva (WhatsApp)</w:t>
-      </w:r>
-    </w:p>
-    <w:p>
-      <w:pPr>
-        <w:spacing w:after="160"/>
-      </w:pPr>
-      <w:r>
-        <w:rPr>
-          <w:b/>
-          <w:bCs/>
-          <w:sz w:val="21"/>
-          <w:szCs w:val="21"/>
-        </w:rPr>
-        <w:t xml:space="preserve">Onde postar:</w:t>
-      </w:r>
-      <w:r>
-        <w:rPr>
-          <w:sz w:val="21"/>
-          <w:szCs w:val="21"/>
-        </w:rPr>
-        <w:t xml:space="preserve"> grupo do WhatsApp, Hub Eleva Síndicos de Alta Performance</w:t>
-      </w:r>
-    </w:p>
-    <w:p>
-      <w:pPr>
-        <w:spacing w:after="160"/>
-      </w:pPr>
-      <w:r>
-        <w:rPr>
-          <w:b/>
-          <w:bCs/>
-          <w:sz w:val="21"/>
-          <w:szCs w:val="21"/>
-        </w:rPr>
-        <w:t xml:space="preserve">Formato:</w:t>
-      </w:r>
-      <w:r>
-        <w:rPr>
-          <w:sz w:val="21"/>
-          <w:szCs w:val="21"/>
-        </w:rPr>
-        <w:t xml:space="preserve"> vertical, estilo Stories</w:t>
+        <w:t xml:space="preserve">"Olá, pessoal! Sou o Giuliano Spolavori, fundador da Eleva. Estou passando aqui para te fazer um convite. Se você é síndico e ainda não faz parte do nosso Hub Eleva, Síndicos de Alta Performance, lá no WhatsApp, você está perdendo tempo. É uma comunidade totalmente gratuita. E nos próximos dias, por lá, vou liberar acesso, só para quem faz parte do grupo, a um portal que estamos desenvolvendo, com muito conteúdo de valor que vai facilitar a sua vida no seu dia a dia de síndico. Porque eu sei que é uma rotina corrida. Então, ali vamos centralizar várias informações que vão te auxiliar na sua gestão, para você conseguir entregar cada vez mais valor para a sua carteira de condomínios. Se você se interessou, entre no nosso Hub Eleva através do link da bio."</w:t>
       </w:r>
     </w:p>
     <w:p>
@@ -327,19 +267,115 @@
           <w:sz w:val="18"/>
           <w:szCs w:val="18"/>
         </w:rPr>
-        <w:t xml:space="preserve">Fala:</w:t>
-      </w:r>
-    </w:p>
-    <w:p>
-      <w:pPr>
-        <w:spacing w:after="160"/>
-      </w:pPr>
-      <w:r>
-        <w:rPr>
-          <w:sz w:val="21"/>
-          <w:szCs w:val="21"/>
-        </w:rPr>
-        <w:t xml:space="preserve">"Giuliano Spolavori aqui, passando para entender como está sendo, para você, a sua experiência no nosso grupo, na nossa comunidade Hub Eleva, Síndicos de Alta Performance. Quero entender como está sendo esse ano para você: a sua gestão, a sua carteira, se teve crescimento, se você está se sentindo estagnado. Quero entender também quais são as suas principais dúvidas e dores, o que está te deixando meio perdido, sem saber como resolver. Então, tanto para entender o seu cenário neste ano de 2026, o quanto você cresceu, o que gostaria de crescer, quanto as suas principais dúvidas e dores, deixe aqui no formulário que vou enviar logo depois deste vídeo. Vamos ler com muito carinho, e eu vou trazer, junto com a minha equipe, conteúdo nas próximas semanas te ajudando a evoluir nesses pontos que vocês comentarem. Aproveitem muito os conteúdos aqui da nossa comunidade. Um abraço!"</w:t>
+        <w:t xml:space="preserve">Legenda do post:</w:t>
+      </w:r>
+    </w:p>
+    <w:p>
+      <w:pPr>
+        <w:spacing w:after="160"/>
+      </w:pPr>
+      <w:r>
+        <w:rPr>
+          <w:sz w:val="21"/>
+          <w:szCs w:val="21"/>
+        </w:rPr>
+        <w:t xml:space="preserve">Você é síndico e ainda não faz parte do nosso Hub Eleva, Síndicos de Alta Performance?</w:t>
+      </w:r>
+    </w:p>
+    <w:p>
+      <w:pPr>
+        <w:spacing w:after="160"/>
+      </w:pPr>
+      <w:r>
+        <w:rPr>
+          <w:sz w:val="21"/>
+          <w:szCs w:val="21"/>
+        </w:rPr>
+        <w:t xml:space="preserve">Uma comunidade gratuita, no WhatsApp, com conteúdo semanal para o seu dia a dia de gestão.</w:t>
+      </w:r>
+    </w:p>
+    <w:p>
+      <w:pPr>
+        <w:spacing w:after="160"/>
+      </w:pPr>
+      <w:r>
+        <w:rPr>
+          <w:sz w:val="21"/>
+          <w:szCs w:val="21"/>
+        </w:rPr>
+        <w:t xml:space="preserve">E em breve, só para quem estiver no grupo, vamos liberar acesso a um portal com muito conteúdo de valor para facilitar a sua rotina como síndico.</w:t>
+      </w:r>
+    </w:p>
+    <w:p>
+      <w:pPr>
+        <w:spacing w:after="160"/>
+      </w:pPr>
+      <w:r>
+        <w:rPr>
+          <w:sz w:val="21"/>
+          <w:szCs w:val="21"/>
+        </w:rPr>
+        <w:t xml:space="preserve">Entra pelo link da bio! 👇</w:t>
+      </w:r>
+    </w:p>
+    <w:p>
+      <w:pPr>
+        <w:pBdr>
+          <w:bottom w:val="single" w:color="cccccc" w:sz="6" w:space="4"/>
+        </w:pBdr>
+        <w:spacing w:after="200"/>
+      </w:pPr>
+    </w:p>
+    <w:p>
+      <w:pPr>
+        <w:pStyle w:val="Heading2"/>
+        <w:keepNext/>
+        <w:spacing w:after="150" w:before="300"/>
+      </w:pPr>
+      <w:r>
+        <w:t xml:space="preserve">Vídeo 3 — Pergunta para o Hub Eleva (WhatsApp)</w:t>
+      </w:r>
+    </w:p>
+    <w:p>
+      <w:pPr>
+        <w:spacing w:after="160"/>
+      </w:pPr>
+      <w:r>
+        <w:rPr>
+          <w:b/>
+          <w:bCs/>
+          <w:sz w:val="21"/>
+          <w:szCs w:val="21"/>
+        </w:rPr>
+        <w:t xml:space="preserve">Onde postar:</w:t>
+      </w:r>
+      <w:r>
+        <w:rPr>
+          <w:sz w:val="21"/>
+          <w:szCs w:val="21"/>
+        </w:rPr>
+        <w:t xml:space="preserve"> grupo do WhatsApp, Hub Eleva Síndicos de Alta Performance</w:t>
+      </w:r>
+    </w:p>
+    <w:p>
+      <w:pPr>
+        <w:spacing w:after="160"/>
+      </w:pPr>
+      <w:r>
+        <w:rPr>
+          <w:b/>
+          <w:bCs/>
+          <w:sz w:val="21"/>
+          <w:szCs w:val="21"/>
+        </w:rPr>
+        <w:t xml:space="preserve">Formato:</w:t>
+      </w:r>
+      <w:r>
+        <w:rPr>
+          <w:sz w:val="21"/>
+          <w:szCs w:val="21"/>
+        </w:rPr>
+        <w:t xml:space="preserve"> vertical, estilo Stories</w:t>
       </w:r>
     </w:p>
     <w:p>
@@ -354,6 +390,33 @@
           <w:sz w:val="18"/>
           <w:szCs w:val="18"/>
         </w:rPr>
+        <w:t xml:space="preserve">Fala:</w:t>
+      </w:r>
+    </w:p>
+    <w:p>
+      <w:pPr>
+        <w:spacing w:after="160"/>
+      </w:pPr>
+      <w:r>
+        <w:rPr>
+          <w:sz w:val="21"/>
+          <w:szCs w:val="21"/>
+        </w:rPr>
+        <w:t xml:space="preserve">"Giuliano Spolavori aqui, passando para entender como está sendo, para você, a sua experiência no nosso grupo, na nossa comunidade Hub Eleva, Síndicos de Alta Performance. Quero entender como está sendo esse ano para você: a sua gestão, a sua carteira, se teve crescimento, se você está se sentindo estagnado. Quero entender também quais são as suas principais dúvidas e dores, o que está te deixando meio perdido, sem saber como resolver. Então, tanto para entender o seu cenário neste ano de 2026, o quanto você cresceu, o que gostaria de crescer, quanto as suas principais dúvidas e dores. Então, preencham o formulário que vamos enviar aqui no grupo. Vamos ler com muito carinho, e eu vou trazer, junto com a minha equipe, conteúdo nas próximas semanas te ajudando a evoluir nesses pontos que vocês comentarem. Aproveitem muito os conteúdos aqui da nossa comunidade. Um abraço!"</w:t>
+      </w:r>
+    </w:p>
+    <w:p>
+      <w:pPr>
+        <w:spacing w:after="80"/>
+      </w:pPr>
+      <w:r>
+        <w:rPr>
+          <w:i/>
+          <w:iCs/>
+          <w:color w:val="555555"/>
+          <w:sz w:val="18"/>
+          <w:szCs w:val="18"/>
+        </w:rPr>
         <w:t xml:space="preserve">Logo abaixo, enviar o link do formulário (Google Forms) com os campos:</w:t>
       </w:r>
     </w:p>
@@ -595,6 +658,57 @@
           <w:szCs w:val="21"/>
         </w:rPr>
         <w:t xml:space="preserve">"Se você presta algum tipo de serviço para condomínio, seja como executivo, síndico ou prestador de serviço, entenda que estar rodeado de um hub de parceiros que te auxiliam nas diversas demandas do condomínio é uma das formas mais fáceis de você expandir a sua carteira, o seu relacionamento, criar network e entregar mais valor para os seus clientes. Assim, todo mundo constrói uma relação de ganha-ganha. Aqui na Eleva, debatemos esse tema de Hub de Negócios tanto no nosso Hub Eleva, Síndicos de Alta Performance, no WhatsApp, quanto por e-mail e no nosso blog. Se você se interessou, comenta aqui 'Hub de Negócios' que eu te mando no direct um formulário para você preencher e começar a receber esses conteúdos, e quem sabe até fazer parte do nosso Hub de Parceiros."</w:t>
+      </w:r>
+    </w:p>
+    <w:p>
+      <w:pPr>
+        <w:spacing w:after="80"/>
+      </w:pPr>
+      <w:r>
+        <w:rPr>
+          <w:i/>
+          <w:iCs/>
+          <w:color w:val="555555"/>
+          <w:sz w:val="18"/>
+          <w:szCs w:val="18"/>
+        </w:rPr>
+        <w:t xml:space="preserve">Legenda do post:</w:t>
+      </w:r>
+    </w:p>
+    <w:p>
+      <w:pPr>
+        <w:spacing w:after="160"/>
+      </w:pPr>
+      <w:r>
+        <w:rPr>
+          <w:sz w:val="21"/>
+          <w:szCs w:val="21"/>
+        </w:rPr>
+        <w:t xml:space="preserve">Você presta algum tipo de serviço para condomínio, seja como executivo, síndico ou fornecedor?</w:t>
+      </w:r>
+    </w:p>
+    <w:p>
+      <w:pPr>
+        <w:spacing w:after="160"/>
+      </w:pPr>
+      <w:r>
+        <w:rPr>
+          <w:sz w:val="21"/>
+          <w:szCs w:val="21"/>
+        </w:rPr>
+        <w:t xml:space="preserve">Estar rodeado de um hub de parceiros que te auxiliam nas diversas demandas do condomínio é uma das formas mais fáceis de expandir a sua carteira, o seu relacionamento e o valor que você entrega, numa relação de ganha-ganha para todo mundo.</w:t>
+      </w:r>
+    </w:p>
+    <w:p>
+      <w:pPr>
+        <w:spacing w:after="160"/>
+      </w:pPr>
+      <w:r>
+        <w:rPr>
+          <w:sz w:val="21"/>
+          <w:szCs w:val="21"/>
+        </w:rPr>
+        <w:t xml:space="preserve">Comenta "Hub de Negócios" aqui embaixo que eu te mando no direct um formulário para você começar a receber esses conteúdos, e quem sabe fazer parte do nosso Hub de Parceiros. 👇</w:t>
       </w:r>
     </w:p>
     <w:p>

</xml_diff>

<commit_message>
Ajusta roteiro do Hub após reunião com Giuliano: renomeia comunidade para Eleva Síndicos de Alta Performance, remove datas, adiciona contexto do portal e período de teste gratuito vs acesso de parceiro do Hub de Negócios
Co-Authored-By: Claude Sonnet 5 <noreply@anthropic.com>
Claude-Session: https://claude.ai/code/session_01GQSqEjEuqv44iBdACeUWUZ
</commit_message>
<xml_diff>
--- a/eleva/roteiro-videos-hub-eleva-hub-negocios.docx
+++ b/eleva/roteiro-videos-hub-eleva-hub-negocios.docx
@@ -8,7 +8,7 @@
         <w:spacing w:after="200"/>
       </w:pPr>
       <w:r>
-        <w:t xml:space="preserve">Roteiro de Vídeos — Hub Eleva e Hub de Negócios</w:t>
+        <w:t xml:space="preserve">Roteiro de Vídeos — Comunidade Eleva e Hub de Negócios</w:t>
       </w:r>
     </w:p>
     <w:p>
@@ -23,7 +23,7 @@
           <w:sz w:val="18"/>
           <w:szCs w:val="18"/>
         </w:rPr>
-        <w:t xml:space="preserve">RECRIA Marketing, 25/09/2026</w:t>
+        <w:t xml:space="preserve">RECRIA Marketing, atualizado em 02/10/2026</w:t>
       </w:r>
     </w:p>
     <w:p>
@@ -66,19 +66,98 @@
           <w:sz w:val="21"/>
           <w:szCs w:val="21"/>
         </w:rPr>
-        <w:t xml:space="preserve">A partir de agora, a Sessão Estratégica fica em stand-by (só é retomada quando o Giuliano achar necessário) e a campanha de compra de carteiras imobiliárias é pausada hoje, 25/09. O foco passa a ser 100% em crescimento de perfil: levar o máximo de seguidores e pessoas interessadas para o Instagram e para o Hub Eleva, para que a compra aconteça de forma proativa, sem a Eleva precisar ir atrás.</w:t>
-      </w:r>
-    </w:p>
-    <w:p>
-      <w:pPr>
-        <w:spacing w:after="160"/>
-      </w:pPr>
-      <w:r>
-        <w:rPr>
-          <w:sz w:val="21"/>
-          <w:szCs w:val="21"/>
-        </w:rPr>
-        <w:t xml:space="preserve">Para isso, seguem 4 vídeos para o Giuliano gravar neste fim de semana, todos em formato vertical (estilo Stories/Reels).</w:t>
+        <w:t xml:space="preserve">O foco atual é 100% em crescimento de perfil: levar o máximo de seguidores e pessoas interessadas para o Instagram e para a comunidade Eleva, Síndicos de Alta Performance, para que a compra aconteça de forma proativa, sem a Eleva precisar ir atrás.</w:t>
+      </w:r>
+    </w:p>
+    <w:p>
+      <w:pPr>
+        <w:spacing w:after="160"/>
+      </w:pPr>
+      <w:r>
+        <w:rPr>
+          <w:b/>
+          <w:bCs/>
+          <w:sz w:val="21"/>
+          <w:szCs w:val="21"/>
+        </w:rPr>
+        <w:t xml:space="preserve">Importante:</w:t>
+      </w:r>
+      <w:r>
+        <w:rPr>
+          <w:sz w:val="21"/>
+          <w:szCs w:val="21"/>
+        </w:rPr>
+        <w:t xml:space="preserve"> nenhum dos roteiros abaixo menciona datas, já que o lançamento do portal ainda não tem data fechada. Usar sempre expressões como "nos próximos dias" ou "em breve".</w:t>
+      </w:r>
+    </w:p>
+    <w:p>
+      <w:pPr>
+        <w:spacing w:after="160"/>
+      </w:pPr>
+      <w:r>
+        <w:rPr>
+          <w:b/>
+          <w:bCs/>
+          <w:sz w:val="21"/>
+          <w:szCs w:val="21"/>
+        </w:rPr>
+        <w:t xml:space="preserve">Mudança de nome:</w:t>
+      </w:r>
+      <w:r>
+        <w:rPr>
+          <w:sz w:val="21"/>
+          <w:szCs w:val="21"/>
+        </w:rPr>
+        <w:t xml:space="preserve"> a comunidade no WhatsApp deixou de se chamar "Hub Eleva, Síndicos de Alta Performance" e passa a se chamar </w:t>
+      </w:r>
+      <w:r>
+        <w:rPr>
+          <w:b/>
+          <w:bCs/>
+          <w:sz w:val="21"/>
+          <w:szCs w:val="21"/>
+        </w:rPr>
+        <w:t xml:space="preserve">"Eleva, Síndicos de Alta Performance"</w:t>
+      </w:r>
+      <w:r>
+        <w:rPr>
+          <w:sz w:val="21"/>
+          <w:szCs w:val="21"/>
+        </w:rPr>
+        <w:t xml:space="preserve">, para não confundir com o Hub de Negócios, que é uma frente separada dentro do guarda-chuva da Eleva (ao lado da Eleva Expansão Estratégica e da Eleva Seguros), reunindo parcerias comerciais com comissão entre profissionais do setor.</w:t>
+      </w:r>
+    </w:p>
+    <w:p>
+      <w:pPr>
+        <w:spacing w:after="160"/>
+      </w:pPr>
+      <w:r>
+        <w:rPr>
+          <w:b/>
+          <w:bCs/>
+          <w:sz w:val="21"/>
+          <w:szCs w:val="21"/>
+        </w:rPr>
+        <w:t xml:space="preserve">Sobre o portal do síndico:</w:t>
+      </w:r>
+      <w:r>
+        <w:rPr>
+          <w:sz w:val="21"/>
+          <w:szCs w:val="21"/>
+        </w:rPr>
+        <w:t xml:space="preserve"> a Eleva está desenvolvendo um portal exclusivo para síndicos, que vai facilitar a gestão, a eficiência, a prestação de contas, assembleias, relação com conselheiros e administradoras. Vai existir um período de teste gratuito para quem quiser experimentar a plataforma. Quem for parceiro do Hub de Negócios tem acesso gratuito ao portal durante todo o tempo em que fizer parte do Hub, enquanto quem não participar do Hub de Negócios tem apenas o período de teste gratuito, mais curto.</w:t>
+      </w:r>
+    </w:p>
+    <w:p>
+      <w:pPr>
+        <w:spacing w:after="160"/>
+      </w:pPr>
+      <w:r>
+        <w:rPr>
+          <w:sz w:val="21"/>
+          <w:szCs w:val="21"/>
+        </w:rPr>
+        <w:t xml:space="preserve">Para isso, seguem 4 vídeos para o Giuliano gravar, todos em formato vertical (estilo Stories/Reels).</w:t>
       </w:r>
     </w:p>
     <w:p>
@@ -96,7 +175,7 @@
         <w:spacing w:after="150" w:before="300"/>
       </w:pPr>
       <w:r>
-        <w:t xml:space="preserve">Vídeo 1 — Aviso no Hub Eleva (WhatsApp)</w:t>
+        <w:t xml:space="preserve">Vídeo 1 — Aviso na comunidade Eleva (WhatsApp)</w:t>
       </w:r>
     </w:p>
     <w:p>
@@ -117,7 +196,7 @@
           <w:sz w:val="21"/>
           <w:szCs w:val="21"/>
         </w:rPr>
-        <w:t xml:space="preserve"> grupo do WhatsApp, Hub Eleva Síndicos de Alta Performance</w:t>
+        <w:t xml:space="preserve"> grupo do WhatsApp, Eleva Síndicos de Alta Performance</w:t>
       </w:r>
     </w:p>
     <w:p>
@@ -139,6 +218,27 @@
           <w:szCs w:val="21"/>
         </w:rPr>
         <w:t xml:space="preserve"> vertical, estilo Stories</w:t>
+      </w:r>
+    </w:p>
+    <w:p>
+      <w:pPr>
+        <w:spacing w:after="160"/>
+      </w:pPr>
+      <w:r>
+        <w:rPr>
+          <w:b/>
+          <w:bCs/>
+          <w:sz w:val="21"/>
+          <w:szCs w:val="21"/>
+        </w:rPr>
+        <w:t xml:space="preserve">Tom:</w:t>
+      </w:r>
+      <w:r>
+        <w:rPr>
+          <w:sz w:val="21"/>
+          <w:szCs w:val="21"/>
+        </w:rPr>
+        <w:t xml:space="preserve"> spoiler, "vem coisa aí"</w:t>
       </w:r>
     </w:p>
     <w:p>
@@ -165,7 +265,67 @@
           <w:sz w:val="21"/>
           <w:szCs w:val="21"/>
         </w:rPr>
-        <w:t xml:space="preserve">"Oi, pessoal! Aqui é o Giuliano, fundador da Eleva. Passando aqui no Hub Eleva, Síndicos de Alta Performance, para avisar vocês que vem novidade por aí. Estamos desenvolvendo um portal que vai te ajudar muito no seu dia a dia como síndico, com vários conteúdos de valor. E quem está aqui no grupo vai ter acesso a esse portal de maneira gratuita. Ou seja, continue no grupo que você só tem a ganhar. Nos próximos dias, trago mais informações para vocês. No mais, aproveitem todo o nosso conteúdo. Um abraço!"</w:t>
+        <w:t xml:space="preserve">"Oi, pessoal! Aqui é o Giuliano, fundador da Eleva. Passando aqui na nossa comunidade, Eleva Síndicos de Alta Performance, para avisar: vem novidade por aí."</w:t>
+      </w:r>
+    </w:p>
+    <w:p>
+      <w:pPr>
+        <w:spacing w:after="160"/>
+      </w:pPr>
+      <w:r>
+        <w:rPr>
+          <w:sz w:val="21"/>
+          <w:szCs w:val="21"/>
+        </w:rPr>
+        <w:t xml:space="preserve">"Estamos desenvolvendo um portal feito exclusivamente para síndicos, que vai facilitar muito a sua gestão. Eficiência no dia a dia, prestação de contas, assembleias, relação com conselheiros e administradoras, tudo isso vai ficar mais simples."</w:t>
+      </w:r>
+    </w:p>
+    <w:p>
+      <w:pPr>
+        <w:spacing w:after="160"/>
+      </w:pPr>
+      <w:r>
+        <w:rPr>
+          <w:sz w:val="21"/>
+          <w:szCs w:val="21"/>
+        </w:rPr>
+        <w:t xml:space="preserve">"Vai ter um período gratuito para você testar a plataforma e ver se faz sentido para você. E quem for parceiro do nosso Hub de Negócios tem acesso gratuito ao portal durante todo o tempo em que fizer parte do Hub."</w:t>
+      </w:r>
+    </w:p>
+    <w:p>
+      <w:pPr>
+        <w:spacing w:after="160"/>
+      </w:pPr>
+      <w:r>
+        <w:rPr>
+          <w:sz w:val="21"/>
+          <w:szCs w:val="21"/>
+        </w:rPr>
+        <w:t xml:space="preserve">"Se quiser saber mais sobre as vantagens e benefícios de participar do Hub de Negócios, fale comigo no privado através do WhatsApp da Eleva."</w:t>
+      </w:r>
+    </w:p>
+    <w:p>
+      <w:pPr>
+        <w:spacing w:after="160"/>
+      </w:pPr>
+      <w:r>
+        <w:rPr>
+          <w:sz w:val="21"/>
+          <w:szCs w:val="21"/>
+        </w:rPr>
+        <w:t xml:space="preserve">🔗 [WhatsApp da Eleva]</w:t>
+      </w:r>
+    </w:p>
+    <w:p>
+      <w:pPr>
+        <w:spacing w:after="160"/>
+      </w:pPr>
+      <w:r>
+        <w:rPr>
+          <w:sz w:val="21"/>
+          <w:szCs w:val="21"/>
+        </w:rPr>
+        <w:t xml:space="preserve">"Nos próximos dias, trago mais informações para vocês. No mais, aproveitem todo o nosso conteúdo. Um abraço!"</w:t>
       </w:r>
     </w:p>
     <w:p>
@@ -183,7 +343,7 @@
         <w:spacing w:after="150" w:before="300"/>
       </w:pPr>
       <w:r>
-        <w:t xml:space="preserve">Vídeo 2 — Convite para o Hub Eleva (Instagram)</w:t>
+        <w:t xml:space="preserve">Vídeo 2 — Convite para a comunidade Eleva (Instagram)</w:t>
       </w:r>
     </w:p>
     <w:p>
@@ -252,7 +412,31 @@
           <w:sz w:val="21"/>
           <w:szCs w:val="21"/>
         </w:rPr>
-        <w:t xml:space="preserve">"Olá, pessoal! Sou o Giuliano Spolavori, fundador da Eleva. Estou passando aqui para te fazer um convite. Se você é síndico e ainda não faz parte do nosso Hub Eleva, Síndicos de Alta Performance, lá no WhatsApp, você está perdendo tempo. É uma comunidade totalmente gratuita. E nos próximos dias, por lá, vou liberar acesso, só para quem faz parte do grupo, a um portal que estamos desenvolvendo, com muito conteúdo de valor que vai facilitar a sua vida no seu dia a dia de síndico. Porque eu sei que é uma rotina corrida. Então, ali vamos centralizar várias informações que vão te auxiliar na sua gestão, para você conseguir entregar cada vez mais valor para a sua carteira de condomínios. Se você se interessou, entre no nosso Hub Eleva através do link da bio."</w:t>
+        <w:t xml:space="preserve">"Olá, pessoal! Sou o Giuliano Spolavori, fundador da Eleva. Estou passando aqui para te fazer um convite. Se você é síndico e ainda não faz parte da nossa comunidade, Eleva Síndicos de Alta Performance, lá no WhatsApp, você está perdendo tempo. É uma comunidade totalmente gratuita."</w:t>
+      </w:r>
+    </w:p>
+    <w:p>
+      <w:pPr>
+        <w:spacing w:after="160"/>
+      </w:pPr>
+      <w:r>
+        <w:rPr>
+          <w:sz w:val="21"/>
+          <w:szCs w:val="21"/>
+        </w:rPr>
+        <w:t xml:space="preserve">"E em breve, por lá, vou contar mais sobre um portal que estamos desenvolvendo, exclusivo para síndicos, com conteúdo de valor que vai facilitar a sua vida no seu dia a dia de gestão, prestação de contas, assembleias e relação com conselheiros e administradoras. Vai ter período gratuito para testar, e quem for parceiro do nosso Hub de Negócios tem acesso gratuito enquanto fizer parte do Hub."</w:t>
+      </w:r>
+    </w:p>
+    <w:p>
+      <w:pPr>
+        <w:spacing w:after="160"/>
+      </w:pPr>
+      <w:r>
+        <w:rPr>
+          <w:sz w:val="21"/>
+          <w:szCs w:val="21"/>
+        </w:rPr>
+        <w:t xml:space="preserve">"Se você se interessou, entre na nossa comunidade através do link da bio."</w:t>
       </w:r>
     </w:p>
     <w:p>
@@ -279,7 +463,7 @@
           <w:sz w:val="21"/>
           <w:szCs w:val="21"/>
         </w:rPr>
-        <w:t xml:space="preserve">Você é síndico e ainda não faz parte do nosso Hub Eleva, Síndicos de Alta Performance?</w:t>
+        <w:t xml:space="preserve">Você é síndico e ainda não faz parte da nossa comunidade, Eleva Síndicos de Alta Performance?</w:t>
       </w:r>
     </w:p>
     <w:p>
@@ -303,7 +487,7 @@
           <w:sz w:val="21"/>
           <w:szCs w:val="21"/>
         </w:rPr>
-        <w:t xml:space="preserve">E em breve, só para quem estiver no grupo, vamos liberar acesso a um portal com muito conteúdo de valor para facilitar a sua rotina como síndico.</w:t>
+        <w:t xml:space="preserve">Em breve, contamos mais sobre um portal exclusivo para síndicos que estamos desenvolvendo, com período gratuito para testar.</w:t>
       </w:r>
     </w:p>
     <w:p>
@@ -333,7 +517,7 @@
         <w:spacing w:after="150" w:before="300"/>
       </w:pPr>
       <w:r>
-        <w:t xml:space="preserve">Vídeo 3 — Pergunta para o Hub Eleva (WhatsApp)</w:t>
+        <w:t xml:space="preserve">Vídeo 3 — Pergunta para a comunidade Eleva (WhatsApp)</w:t>
       </w:r>
     </w:p>
     <w:p>
@@ -354,7 +538,7 @@
           <w:sz w:val="21"/>
           <w:szCs w:val="21"/>
         </w:rPr>
-        <w:t xml:space="preserve"> grupo do WhatsApp, Hub Eleva Síndicos de Alta Performance</w:t>
+        <w:t xml:space="preserve"> grupo do WhatsApp, Eleva Síndicos de Alta Performance</w:t>
       </w:r>
     </w:p>
     <w:p>
@@ -402,7 +586,7 @@
           <w:sz w:val="21"/>
           <w:szCs w:val="21"/>
         </w:rPr>
-        <w:t xml:space="preserve">"Giuliano Spolavori aqui, passando para entender como está sendo, para você, a sua experiência no nosso grupo, na nossa comunidade Hub Eleva, Síndicos de Alta Performance. Quero entender como está sendo esse ano para você: a sua gestão, a sua carteira, se teve crescimento, se você está se sentindo estagnado. Quero entender também quais são as suas principais dúvidas e dores, o que está te deixando meio perdido, sem saber como resolver. Então, tanto para entender o seu cenário neste ano de 2026, o quanto você cresceu, o que gostaria de crescer, quanto as suas principais dúvidas e dores. Então, preencham o formulário que vamos enviar aqui no grupo. Vamos ler com muito carinho, e eu vou trazer, junto com a minha equipe, conteúdo nas próximas semanas te ajudando a evoluir nesses pontos que vocês comentarem. Aproveitem muito os conteúdos aqui da nossa comunidade. Um abraço!"</w:t>
+        <w:t xml:space="preserve">"Giuliano Spolavori aqui, passando para entender como está sendo, para você, a sua experiência na nossa comunidade, Eleva Síndicos de Alta Performance. Quero entender como está sendo esse ano para você: a sua gestão, a sua carteira, se teve crescimento, se você está se sentindo estagnado. Quero entender também quais são as suas principais dúvidas e dores, o que está te deixando meio perdido, sem saber como resolver. Então, tanto para entender o seu cenário, o quanto você cresceu, o que gostaria de crescer, quanto as suas principais dúvidas e dores. Então, preencham o formulário que vamos enviar aqui no grupo. Vamos ler com muito carinho, e eu vou trazer, junto com a minha equipe, conteúdo nas próximas semanas te ajudando a evoluir nesses pontos que vocês comentarem. Aproveitem muito os conteúdos aqui da nossa comunidade. Um abraço!"</w:t>
       </w:r>
     </w:p>
     <w:p>
@@ -485,7 +669,7 @@
           <w:sz w:val="21"/>
           <w:szCs w:val="21"/>
         </w:rPr>
-        <w:t xml:space="preserve">4. Confirma se faz parte do Hub Eleva</w:t>
+        <w:t xml:space="preserve">4. Confirma se faz parte da comunidade Eleva</w:t>
       </w:r>
     </w:p>
     <w:p>
@@ -502,7 +686,7 @@
           <w:sz w:val="21"/>
           <w:szCs w:val="21"/>
         </w:rPr>
-        <w:t xml:space="preserve">5. Como tem sido a evolução em 2026</w:t>
+        <w:t xml:space="preserve">5. Como tem sido a evolução neste ano</w:t>
       </w:r>
     </w:p>
     <w:p>
@@ -536,7 +720,7 @@
           <w:sz w:val="21"/>
           <w:szCs w:val="21"/>
         </w:rPr>
-        <w:t xml:space="preserve">7. O que projeta para 2027</w:t>
+        <w:t xml:space="preserve">7. O que projeta para o próximo ano</w:t>
       </w:r>
     </w:p>
     <w:p>
@@ -570,7 +754,7 @@
           <w:sz w:val="21"/>
           <w:szCs w:val="21"/>
         </w:rPr>
-        <w:t xml:space="preserve">9. Mensagem final: agradecimento, avisando que nos próximos dias a pessoa também vai ter acesso ao portal do síndico que a Eleva está desenvolvendo</w:t>
+        <w:t xml:space="preserve">9. Mensagem final: agradecimento, avisando que nos próximos dias a pessoa também vai ter acesso a novidades sobre o portal do síndico que a Eleva está desenvolvendo</w:t>
       </w:r>
     </w:p>
     <w:p>
@@ -657,7 +841,7 @@
           <w:sz w:val="21"/>
           <w:szCs w:val="21"/>
         </w:rPr>
-        <w:t xml:space="preserve">"Se você presta algum tipo de serviço para condomínio, seja como executivo, síndico ou prestador de serviço, entenda que estar rodeado de um hub de parceiros que te auxiliam nas diversas demandas do condomínio é uma das formas mais fáceis de você expandir a sua carteira, o seu relacionamento, criar network e entregar mais valor para os seus clientes. Assim, todo mundo constrói uma relação de ganha-ganha. Aqui na Eleva, debatemos esse tema de Hub de Negócios tanto no nosso Hub Eleva, Síndicos de Alta Performance, no WhatsApp, quanto por e-mail e no nosso blog. Se você se interessou, comenta aqui 'Hub de Negócios' que eu te mando no direct um formulário para você preencher e começar a receber esses conteúdos, e quem sabe até fazer parte do nosso Hub de Parceiros."</w:t>
+        <w:t xml:space="preserve">"Se você presta algum tipo de serviço para condomínio, seja como executivo, síndico ou prestador de serviço, entenda que estar rodeado de um hub de parceiros que te auxiliam nas diversas demandas do condomínio é uma das formas mais fáceis de você expandir a sua carteira, o seu relacionamento, criar network e entregar mais valor para os seus clientes. Assim, todo mundo constrói uma relação de ganha-ganha. Aqui na Eleva, dentro do guarda-chuva do Eleva Group, temos justamente o Hub de Negócios, onde desenvolvemos exatamente esses pontos. Se você se interessou, comenta aqui 'Hub de Negócios' que eu te mando no direct um formulário para você preencher e começar a receber esses conteúdos, e quem sabe até fazer parte do nosso Hub de Parceiros."</w:t>
       </w:r>
     </w:p>
     <w:p>
@@ -835,7 +1019,7 @@
           <w:sz w:val="20"/>
           <w:szCs w:val="20"/>
         </w:rPr>
-        <w:t xml:space="preserve">E se você é síndico, também deixo aqui o convite para participar do nosso Hub Eleva, Síndicos de Alta Performance, no WhatsApp, uma comunidade gratuita com conteúdo semanal para o seu dia a dia de gestão.</w:t>
+        <w:t xml:space="preserve">E se você é síndico, também deixo aqui o convite para participar da nossa comunidade, Eleva Síndicos de Alta Performance, no WhatsApp, uma comunidade gratuita com conteúdo semanal para o seu dia a dia de gestão.</w:t>
       </w:r>
     </w:p>
     <w:p>
@@ -1022,7 +1206,7 @@
                 <w:sz w:val="19"/>
                 <w:szCs w:val="19"/>
               </w:rPr>
-              <w:t xml:space="preserve">Hub Eleva (WhatsApp)</w:t>
+              <w:t xml:space="preserve">Comunidade Eleva (WhatsApp)</w:t>
             </w:r>
           </w:p>
         </w:tc>
@@ -1128,7 +1312,7 @@
                 <w:sz w:val="19"/>
                 <w:szCs w:val="19"/>
               </w:rPr>
-              <w:t xml:space="preserve">Hub Eleva (WhatsApp)</w:t>
+              <w:t xml:space="preserve">Comunidade Eleva (WhatsApp)</w:t>
             </w:r>
           </w:p>
         </w:tc>

</xml_diff>

<commit_message>
Adiciona carrossel de lançamento do Portal do Síndico (7 slides, legenda e automação)
Co-Authored-By: Claude Sonnet 5 <noreply@anthropic.com>
Claude-Session: https://claude.ai/code/session_01GQSqEjEuqv44iBdACeUWUZ
</commit_message>
<xml_diff>
--- a/eleva/roteiro-videos-hub-eleva-hub-negocios.docx
+++ b/eleva/roteiro-videos-hub-eleva-hub-negocios.docx
@@ -1082,6 +1082,339 @@
           <w:szCs w:val="20"/>
         </w:rPr>
         <w:t xml:space="preserve">Qualquer dúvida, é só me chamar por aqui!</w:t>
+      </w:r>
+    </w:p>
+    <w:p>
+      <w:pPr>
+        <w:pBdr>
+          <w:bottom w:val="single" w:color="cccccc" w:sz="6" w:space="4"/>
+        </w:pBdr>
+        <w:spacing w:after="200"/>
+      </w:pPr>
+    </w:p>
+    <w:p>
+      <w:pPr>
+        <w:pStyle w:val="Heading2"/>
+        <w:keepNext/>
+        <w:spacing w:after="150" w:before="300"/>
+      </w:pPr>
+      <w:r>
+        <w:t xml:space="preserve">Carrossel — Lançamento do Portal do Síndico (Instagram)</w:t>
+      </w:r>
+    </w:p>
+    <w:p>
+      <w:pPr>
+        <w:spacing w:after="160"/>
+      </w:pPr>
+      <w:r>
+        <w:rPr>
+          <w:b/>
+          <w:bCs/>
+          <w:sz w:val="21"/>
+          <w:szCs w:val="21"/>
+        </w:rPr>
+        <w:t xml:space="preserve">Onde postar:</w:t>
+      </w:r>
+      <w:r>
+        <w:rPr>
+          <w:sz w:val="21"/>
+          <w:szCs w:val="21"/>
+        </w:rPr>
+        <w:t xml:space="preserve"> Instagram, carrossel</w:t>
+      </w:r>
+    </w:p>
+    <w:p>
+      <w:pPr>
+        <w:spacing w:after="160"/>
+      </w:pPr>
+      <w:r>
+        <w:rPr>
+          <w:b/>
+          <w:bCs/>
+          <w:sz w:val="21"/>
+          <w:szCs w:val="21"/>
+        </w:rPr>
+        <w:t xml:space="preserve">Estrutura:</w:t>
+      </w:r>
+      <w:r>
+        <w:rPr>
+          <w:sz w:val="21"/>
+          <w:szCs w:val="21"/>
+        </w:rPr>
+        <w:t xml:space="preserve"> gancho/headline que atrai → desenvolve a ideia gerando identificação → mostra a solução (o portal) → avisa que está em lançamento, com CTA</w:t>
+      </w:r>
+    </w:p>
+    <w:p>
+      <w:pPr>
+        <w:spacing w:after="80"/>
+      </w:pPr>
+      <w:r>
+        <w:rPr>
+          <w:i/>
+          <w:iCs/>
+          <w:color w:val="555555"/>
+          <w:sz w:val="18"/>
+          <w:szCs w:val="18"/>
+        </w:rPr>
+        <w:t xml:space="preserve">Slide 1 — Gancho:</w:t>
+      </w:r>
+    </w:p>
+    <w:p>
+      <w:pPr>
+        <w:spacing w:after="160"/>
+      </w:pPr>
+      <w:r>
+        <w:rPr>
+          <w:sz w:val="21"/>
+          <w:szCs w:val="21"/>
+        </w:rPr>
+        <w:t xml:space="preserve">"O síndico que mais cresce não é o que trabalha mais. É o que tem menos coisa passando pela cabeça dele."</w:t>
+      </w:r>
+    </w:p>
+    <w:p>
+      <w:pPr>
+        <w:spacing w:after="80"/>
+      </w:pPr>
+      <w:r>
+        <w:rPr>
+          <w:i/>
+          <w:iCs/>
+          <w:color w:val="555555"/>
+          <w:sz w:val="18"/>
+          <w:szCs w:val="18"/>
+        </w:rPr>
+        <w:t xml:space="preserve">Slide 2 — Identificação:</w:t>
+      </w:r>
+    </w:p>
+    <w:p>
+      <w:pPr>
+        <w:spacing w:after="160"/>
+      </w:pPr>
+      <w:r>
+        <w:rPr>
+          <w:sz w:val="21"/>
+          <w:szCs w:val="21"/>
+        </w:rPr>
+        <w:t xml:space="preserve">"Prestação de contas, assembleia, conselho, administradora, cada um puxando pra um lado, e tudo dependendo da sua memória e das suas planilhas."</w:t>
+      </w:r>
+    </w:p>
+    <w:p>
+      <w:pPr>
+        <w:spacing w:after="80"/>
+      </w:pPr>
+      <w:r>
+        <w:rPr>
+          <w:i/>
+          <w:iCs/>
+          <w:color w:val="555555"/>
+          <w:sz w:val="18"/>
+          <w:szCs w:val="18"/>
+        </w:rPr>
+        <w:t xml:space="preserve">Slide 3 — Identificação (continuação):</w:t>
+      </w:r>
+    </w:p>
+    <w:p>
+      <w:pPr>
+        <w:spacing w:after="160"/>
+      </w:pPr>
+      <w:r>
+        <w:rPr>
+          <w:sz w:val="21"/>
+          <w:szCs w:val="21"/>
+        </w:rPr>
+        <w:t xml:space="preserve">"E quando alguma coisa passa batido, quem segura a cobrança é você."</w:t>
+      </w:r>
+    </w:p>
+    <w:p>
+      <w:pPr>
+        <w:spacing w:after="80"/>
+      </w:pPr>
+      <w:r>
+        <w:rPr>
+          <w:i/>
+          <w:iCs/>
+          <w:color w:val="555555"/>
+          <w:sz w:val="18"/>
+          <w:szCs w:val="18"/>
+        </w:rPr>
+        <w:t xml:space="preserve">Slide 4 — Ponte para a solução:</w:t>
+      </w:r>
+    </w:p>
+    <w:p>
+      <w:pPr>
+        <w:spacing w:after="160"/>
+      </w:pPr>
+      <w:r>
+        <w:rPr>
+          <w:sz w:val="21"/>
+          <w:szCs w:val="21"/>
+        </w:rPr>
+        <w:t xml:space="preserve">"E se existisse um lugar só, pensado especificamente para a rotina do síndico, que organiza tudo isso?"</w:t>
+      </w:r>
+    </w:p>
+    <w:p>
+      <w:pPr>
+        <w:spacing w:after="80"/>
+      </w:pPr>
+      <w:r>
+        <w:rPr>
+          <w:i/>
+          <w:iCs/>
+          <w:color w:val="555555"/>
+          <w:sz w:val="18"/>
+          <w:szCs w:val="18"/>
+        </w:rPr>
+        <w:t xml:space="preserve">Slide 5 — Solução:</w:t>
+      </w:r>
+    </w:p>
+    <w:p>
+      <w:pPr>
+        <w:spacing w:after="160"/>
+      </w:pPr>
+      <w:r>
+        <w:rPr>
+          <w:sz w:val="21"/>
+          <w:szCs w:val="21"/>
+        </w:rPr>
+        <w:t xml:space="preserve">"Estamos desenvolvendo o Portal do Síndico da Eleva. Feito para facilitar a sua gestão, a sua prestação de contas, as suas assembleias e a sua relação com conselheiros e administradoras."</w:t>
+      </w:r>
+    </w:p>
+    <w:p>
+      <w:pPr>
+        <w:spacing w:after="80"/>
+      </w:pPr>
+      <w:r>
+        <w:rPr>
+          <w:i/>
+          <w:iCs/>
+          <w:color w:val="555555"/>
+          <w:sz w:val="18"/>
+          <w:szCs w:val="18"/>
+        </w:rPr>
+        <w:t xml:space="preserve">Slide 6 — Lançamento:</w:t>
+      </w:r>
+    </w:p>
+    <w:p>
+      <w:pPr>
+        <w:spacing w:after="160"/>
+      </w:pPr>
+      <w:r>
+        <w:rPr>
+          <w:sz w:val="21"/>
+          <w:szCs w:val="21"/>
+        </w:rPr>
+        <w:t xml:space="preserve">"Já estamos em fase de lançamento, com período gratuito para você testar."</w:t>
+      </w:r>
+    </w:p>
+    <w:p>
+      <w:pPr>
+        <w:spacing w:after="80"/>
+      </w:pPr>
+      <w:r>
+        <w:rPr>
+          <w:i/>
+          <w:iCs/>
+          <w:color w:val="555555"/>
+          <w:sz w:val="18"/>
+          <w:szCs w:val="18"/>
+        </w:rPr>
+        <w:t xml:space="preserve">Slide 7 — CTA:</w:t>
+      </w:r>
+    </w:p>
+    <w:p>
+      <w:pPr>
+        <w:spacing w:after="160"/>
+      </w:pPr>
+      <w:r>
+        <w:rPr>
+          <w:sz w:val="21"/>
+          <w:szCs w:val="21"/>
+        </w:rPr>
+        <w:t xml:space="preserve">"Comenta 'PORTAL' que eu te mando todas as informações no direct, ou se preferir, acessa pelo link da bio."</w:t>
+      </w:r>
+    </w:p>
+    <w:p>
+      <w:pPr>
+        <w:spacing w:after="80"/>
+      </w:pPr>
+      <w:r>
+        <w:rPr>
+          <w:i/>
+          <w:iCs/>
+          <w:color w:val="555555"/>
+          <w:sz w:val="18"/>
+          <w:szCs w:val="18"/>
+        </w:rPr>
+        <w:t xml:space="preserve">Legenda do post:</w:t>
+      </w:r>
+    </w:p>
+    <w:p>
+      <w:pPr>
+        <w:spacing w:after="160"/>
+      </w:pPr>
+      <w:r>
+        <w:rPr>
+          <w:sz w:val="21"/>
+          <w:szCs w:val="21"/>
+        </w:rPr>
+        <w:t xml:space="preserve">O síndico que mais cresce não é o que trabalha mais, é o que tem menos coisa passando pela cabeça dele.</w:t>
+      </w:r>
+    </w:p>
+    <w:p>
+      <w:pPr>
+        <w:spacing w:after="160"/>
+      </w:pPr>
+      <w:r>
+        <w:rPr>
+          <w:sz w:val="21"/>
+          <w:szCs w:val="21"/>
+        </w:rPr>
+        <w:t xml:space="preserve">Prestação de contas, assembleia, conselho, administradora, cada um puxando pra um lado, tudo dependendo da sua memória. E quando algo passa batido, quem segura a cobrança é você.</w:t>
+      </w:r>
+    </w:p>
+    <w:p>
+      <w:pPr>
+        <w:spacing w:after="160"/>
+      </w:pPr>
+      <w:r>
+        <w:rPr>
+          <w:sz w:val="21"/>
+          <w:szCs w:val="21"/>
+        </w:rPr>
+        <w:t xml:space="preserve">Estamos lançando o Portal do Síndico da Eleva, feito para facilitar sua gestão, sua prestação de contas, suas assembleias e sua relação com conselheiros e administradoras. Com período gratuito para testar.</w:t>
+      </w:r>
+    </w:p>
+    <w:p>
+      <w:pPr>
+        <w:spacing w:after="160"/>
+      </w:pPr>
+      <w:r>
+        <w:rPr>
+          <w:sz w:val="21"/>
+          <w:szCs w:val="21"/>
+        </w:rPr>
+        <w:t xml:space="preserve">Comenta "PORTAL" 👇 ou acessa pelo link da bio.</w:t>
+      </w:r>
+    </w:p>
+    <w:p>
+      <w:pPr>
+        <w:spacing w:after="160"/>
+      </w:pPr>
+      <w:r>
+        <w:rPr>
+          <w:b/>
+          <w:bCs/>
+          <w:sz w:val="21"/>
+          <w:szCs w:val="21"/>
+        </w:rPr>
+        <w:t xml:space="preserve">Automação de direct (gatilho: comentário "PORTAL"):</w:t>
+      </w:r>
+      <w:r>
+        <w:rPr>
+          <w:sz w:val="21"/>
+          <w:szCs w:val="21"/>
+        </w:rPr>
+        <w:t xml:space="preserve"> enviar todas as informações sobre o Portal do Síndico e o período de teste gratuito, com destaque para o acesso estendido de quem for parceiro do Hub de Negócios.</w:t>
       </w:r>
     </w:p>
     <w:p>
@@ -1134,7 +1467,7 @@
                 <w:sz w:val="19"/>
                 <w:szCs w:val="19"/>
               </w:rPr>
-              <w:t xml:space="preserve">Vídeo</w:t>
+              <w:t xml:space="preserve">Peça</w:t>
             </w:r>
           </w:p>
         </w:tc>
@@ -1189,7 +1522,7 @@
                 <w:sz w:val="19"/>
                 <w:szCs w:val="19"/>
               </w:rPr>
-              <w:t xml:space="preserve">1</w:t>
+              <w:t xml:space="preserve">Vídeo 1</w:t>
             </w:r>
           </w:p>
         </w:tc>
@@ -1242,7 +1575,7 @@
                 <w:sz w:val="19"/>
                 <w:szCs w:val="19"/>
               </w:rPr>
-              <w:t xml:space="preserve">2</w:t>
+              <w:t xml:space="preserve">Vídeo 2</w:t>
             </w:r>
           </w:p>
         </w:tc>
@@ -1295,7 +1628,7 @@
                 <w:sz w:val="19"/>
                 <w:szCs w:val="19"/>
               </w:rPr>
-              <w:t xml:space="preserve">3</w:t>
+              <w:t xml:space="preserve">Vídeo 3</w:t>
             </w:r>
           </w:p>
         </w:tc>
@@ -1348,7 +1681,7 @@
                 <w:sz w:val="19"/>
                 <w:szCs w:val="19"/>
               </w:rPr>
-              <w:t xml:space="preserve">4</w:t>
+              <w:t xml:space="preserve">Vídeo 4</w:t>
             </w:r>
           </w:p>
         </w:tc>
@@ -1383,6 +1716,59 @@
                 <w:szCs w:val="19"/>
               </w:rPr>
               <w:t xml:space="preserve">Reels</w:t>
+            </w:r>
+          </w:p>
+        </w:tc>
+      </w:tr>
+      <w:tr>
+        <w:tc>
+          <w:tcPr>
+            <w:tcW w:type="dxa" w:w="3008"/>
+          </w:tcPr>
+          <w:p>
+            <w:r>
+              <w:rPr>
+                <w:b w:val="false"/>
+                <w:bCs w:val="false"/>
+                <w:color w:val="000000"/>
+                <w:sz w:val="19"/>
+                <w:szCs w:val="19"/>
+              </w:rPr>
+              <w:t xml:space="preserve">Carrossel</w:t>
+            </w:r>
+          </w:p>
+        </w:tc>
+        <w:tc>
+          <w:tcPr>
+            <w:tcW w:type="dxa" w:w="3008"/>
+          </w:tcPr>
+          <w:p>
+            <w:r>
+              <w:rPr>
+                <w:b w:val="false"/>
+                <w:bCs w:val="false"/>
+                <w:color w:val="000000"/>
+                <w:sz w:val="19"/>
+                <w:szCs w:val="19"/>
+              </w:rPr>
+              <w:t xml:space="preserve">Instagram</w:t>
+            </w:r>
+          </w:p>
+        </w:tc>
+        <w:tc>
+          <w:tcPr>
+            <w:tcW w:type="dxa" w:w="3008"/>
+          </w:tcPr>
+          <w:p>
+            <w:r>
+              <w:rPr>
+                <w:b w:val="false"/>
+                <w:bCs w:val="false"/>
+                <w:color w:val="000000"/>
+                <w:sz w:val="19"/>
+                <w:szCs w:val="19"/>
+              </w:rPr>
+              <w:t xml:space="preserve">Carrossel, 7 slides</w:t>
             </w:r>
           </w:p>
         </w:tc>

</xml_diff>

<commit_message>
Adiciona gancho de "primeira mão" no Vídeo 2 para tornar a entrada na comunidade mais atrativa
Co-Authored-By: Claude Sonnet 5 <noreply@anthropic.com>
Claude-Session: https://claude.ai/code/session_01GQSqEjEuqv44iBdACeUWUZ
</commit_message>
<xml_diff>
--- a/eleva/roteiro-videos-hub-eleva-hub-negocios.docx
+++ b/eleva/roteiro-videos-hub-eleva-hub-negocios.docx
@@ -424,7 +424,7 @@
           <w:sz w:val="21"/>
           <w:szCs w:val="21"/>
         </w:rPr>
-        <w:t xml:space="preserve">"E em breve, por lá, vou contar mais sobre um portal que estamos desenvolvendo, exclusivo para síndicos, com conteúdo de valor que vai facilitar a sua vida no seu dia a dia de gestão, prestação de contas, assembleias e relação com conselheiros e administradoras. Vai ter período gratuito para testar, e quem for parceiro do nosso Hub de Negócios tem acesso gratuito enquanto fizer parte do Hub."</w:t>
+        <w:t xml:space="preserve">"E tem um motivo a mais para você entrar agora: estamos desenvolvendo um portal exclusivo para síndicos, com conteúdo de valor que vai facilitar a sua vida no seu dia a dia de gestão, prestação de contas, assembleias e relação com conselheiros e administradoras. E quem estiver na nossa comunidade vai ficar sabendo em primeira mão, antes de qualquer outro canal, assim que o portal for lançado, com período gratuito para testar."</w:t>
       </w:r>
     </w:p>
     <w:p>
@@ -487,7 +487,7 @@
           <w:sz w:val="21"/>
           <w:szCs w:val="21"/>
         </w:rPr>
-        <w:t xml:space="preserve">Em breve, contamos mais sobre um portal exclusivo para síndicos que estamos desenvolvendo, com período gratuito para testar.</w:t>
+        <w:t xml:space="preserve">E tem um motivo a mais para entrar agora: estamos desenvolvendo um portal exclusivo para síndicos, e quem está na comunidade fica sabendo em primeira mão, antes de qualquer outro canal, assim que lançar, com período gratuito para testar.</w:t>
       </w:r>
     </w:p>
     <w:p>

</xml_diff>

<commit_message>
Adiciona palavra-chave COMUNIDADE como gatilho de automação no Vídeo 2, além do link da bio
Co-Authored-By: Claude Sonnet 5 <noreply@anthropic.com>
Claude-Session: https://claude.ai/code/session_01GQSqEjEuqv44iBdACeUWUZ
</commit_message>
<xml_diff>
--- a/eleva/roteiro-videos-hub-eleva-hub-negocios.docx
+++ b/eleva/roteiro-videos-hub-eleva-hub-negocios.docx
@@ -436,7 +436,70 @@
           <w:sz w:val="21"/>
           <w:szCs w:val="21"/>
         </w:rPr>
-        <w:t xml:space="preserve">"Se você se interessou, entre na nossa comunidade através do link da bio."</w:t>
+        <w:t xml:space="preserve">"Se você se interessou, comenta: COMUNIDADE, que eu te mando o link no direct, ou se preferir, entre direto através do link da bio."</w:t>
+      </w:r>
+    </w:p>
+    <w:p>
+      <w:pPr>
+        <w:spacing w:after="160"/>
+      </w:pPr>
+      <w:r>
+        <w:rPr>
+          <w:b/>
+          <w:bCs/>
+          <w:sz w:val="21"/>
+          <w:szCs w:val="21"/>
+        </w:rPr>
+        <w:t xml:space="preserve">Duração estimada:</w:t>
+      </w:r>
+      <w:r>
+        <w:rPr>
+          <w:sz w:val="21"/>
+          <w:szCs w:val="21"/>
+        </w:rPr>
+        <w:t xml:space="preserve"> 40-45 segundos</w:t>
+      </w:r>
+    </w:p>
+    <w:p>
+      <w:pPr>
+        <w:spacing w:after="160"/>
+      </w:pPr>
+      <w:r>
+        <w:rPr>
+          <w:b/>
+          <w:bCs/>
+          <w:sz w:val="21"/>
+          <w:szCs w:val="21"/>
+        </w:rPr>
+        <w:t xml:space="preserve">CTA:</w:t>
+      </w:r>
+      <w:r>
+        <w:rPr>
+          <w:sz w:val="21"/>
+          <w:szCs w:val="21"/>
+        </w:rPr>
+        <w:t xml:space="preserve"> "Clica no link e entra para a comunidade"</w:t>
+      </w:r>
+    </w:p>
+    <w:p>
+      <w:pPr>
+        <w:spacing w:after="160"/>
+      </w:pPr>
+      <w:r>
+        <w:rPr>
+          <w:b/>
+          <w:bCs/>
+          <w:sz w:val="21"/>
+          <w:szCs w:val="21"/>
+        </w:rPr>
+        <w:t xml:space="preserve">Automação de direct (gatilho: comentário "COMUNIDADE"):</w:t>
+      </w:r>
+      <w:r>
+        <w:rPr>
+          <w:sz w:val="21"/>
+          <w:szCs w:val="21"/>
+        </w:rPr>
+        <w:t xml:space="preserve"> enviar o link de entrada da comunidade Eleva Síndicos de Alta Performance no WhatsApp.</w:t>
       </w:r>
     </w:p>
     <w:p>
@@ -499,7 +562,7 @@
           <w:sz w:val="21"/>
           <w:szCs w:val="21"/>
         </w:rPr>
-        <w:t xml:space="preserve">Entra pelo link da bio! 👇</w:t>
+        <w:t xml:space="preserve">Comenta "COMUNIDADE" 👇 ou entra direto pelo link da bio!</w:t>
       </w:r>
     </w:p>
     <w:p>

</xml_diff>

<commit_message>
Deixa linguagem do Vídeo 1 mais formal (vai ter -> teremos, clica -> toque, trago -> trarei)
Co-Authored-By: Claude Sonnet 5 <noreply@anthropic.com>
Claude-Session: https://claude.ai/code/session_01GQSqEjEuqv44iBdACeUWUZ
</commit_message>
<xml_diff>
--- a/eleva/roteiro-videos-hub-eleva-hub-negocios.docx
+++ b/eleva/roteiro-videos-hub-eleva-hub-negocios.docx
@@ -289,19 +289,19 @@
           <w:sz w:val="21"/>
           <w:szCs w:val="21"/>
         </w:rPr>
-        <w:t xml:space="preserve">"Vai ter um período gratuito para você testar a plataforma e ver se faz sentido para você. E quem for parceiro do nosso Hub de Negócios tem acesso gratuito ao portal durante todo o tempo em que fizer parte do Hub."</w:t>
-      </w:r>
-    </w:p>
-    <w:p>
-      <w:pPr>
-        <w:spacing w:after="160"/>
-      </w:pPr>
-      <w:r>
-        <w:rPr>
-          <w:sz w:val="21"/>
-          <w:szCs w:val="21"/>
-        </w:rPr>
-        <w:t xml:space="preserve">"Se quiser saber mais sobre as vantagens e benefícios de participar do Hub de Negócios, clica no link que vamos enviar abaixo desse vídeo. Ele vai te direcionar para uma conversa no privado com o WhatsApp da Eleva, e lá a gente te passa todas as informações."</w:t>
+        <w:t xml:space="preserve">"Teremos um período gratuito para você testar a plataforma e ver se faz sentido para você. E quem for parceiro do nosso Hub de Negócios terá acesso gratuito ao portal durante todo o tempo que fizer parte do Hub."</w:t>
+      </w:r>
+    </w:p>
+    <w:p>
+      <w:pPr>
+        <w:spacing w:after="160"/>
+      </w:pPr>
+      <w:r>
+        <w:rPr>
+          <w:sz w:val="21"/>
+          <w:szCs w:val="21"/>
+        </w:rPr>
+        <w:t xml:space="preserve">"Se quiser saber mais sobre as vantagens e benefícios de participar do Hub de Negócios, toque no link que vamos enviar abaixo desse vídeo. Ele vai te direcionar para uma conversa no privado com o WhatsApp da Eleva, e lá iremos te passar todas as informações."</w:t>
       </w:r>
     </w:p>
     <w:p>
@@ -325,7 +325,7 @@
           <w:sz w:val="21"/>
           <w:szCs w:val="21"/>
         </w:rPr>
-        <w:t xml:space="preserve">"Nos próximos dias, trago mais informações para vocês. No mais, aproveitem todo o nosso conteúdo. Um abraço!"</w:t>
+        <w:t xml:space="preserve">"Nos próximos dias, trarei mais informações para vocês. No mais, aproveitem todo o nosso conteúdo aqui da comunidade. Um abraço!"</w:t>
       </w:r>
     </w:p>
     <w:p>

</xml_diff>

<commit_message>
Melhora fluxo do Vídeo 3, removendo repetição de "então" e reforçando que o formulário personaliza o conteúdo
Co-Authored-By: Claude Sonnet 5 <noreply@anthropic.com>
Claude-Session: https://claude.ai/code/session_01GQSqEjEuqv44iBdACeUWUZ
</commit_message>
<xml_diff>
--- a/eleva/roteiro-videos-hub-eleva-hub-negocios.docx
+++ b/eleva/roteiro-videos-hub-eleva-hub-negocios.docx
@@ -649,7 +649,43 @@
           <w:sz w:val="21"/>
           <w:szCs w:val="21"/>
         </w:rPr>
-        <w:t xml:space="preserve">"Giuliano Spolavori aqui, passando para entender como está sendo, para você, a sua experiência na nossa comunidade, Eleva Síndicos de Alta Performance. Quero entender como está sendo esse ano para você: a sua gestão, a sua carteira, se teve crescimento, se você está se sentindo estagnado. Quero entender também quais são as suas principais dúvidas e dores, o que está te deixando meio perdido, sem saber como resolver. Então, tanto para entender o seu cenário, o quanto você cresceu, o que gostaria de crescer, quanto as suas principais dúvidas e dores. Então, preencham o formulário que vamos enviar aqui no grupo. Vamos ler com muito carinho, e eu vou trazer, junto com a minha equipe, conteúdo nas próximas semanas te ajudando a evoluir nesses pontos que vocês comentarem. Aproveitem muito os conteúdos aqui da nossa comunidade. Um abraço!"</w:t>
+        <w:t xml:space="preserve">"Giuliano Spolavori aqui, passando para entender como está sendo, para você, a sua experiência na nossa comunidade, Eleva Síndicos de Alta Performance.</w:t>
+      </w:r>
+    </w:p>
+    <w:p>
+      <w:pPr>
+        <w:spacing w:after="160"/>
+      </w:pPr>
+      <w:r>
+        <w:rPr>
+          <w:sz w:val="21"/>
+          <w:szCs w:val="21"/>
+        </w:rPr>
+        <w:t xml:space="preserve">Quero entender como está sendo esse ano para você: a sua gestão, a sua carteira, se teve crescimento, se você está se sentindo estagnado. E também quais são as suas principais dúvidas e dores, o que está te deixando meio perdido, sem saber como resolver.</w:t>
+      </w:r>
+    </w:p>
+    <w:p>
+      <w:pPr>
+        <w:spacing w:after="160"/>
+      </w:pPr>
+      <w:r>
+        <w:rPr>
+          <w:sz w:val="21"/>
+          <w:szCs w:val="21"/>
+        </w:rPr>
+        <w:t xml:space="preserve">Para isso, preencham o formulário que vamos enviar aqui no grupo, logo abaixo deste vídeo. Vamos ler com muito carinho cada resposta, e eu vou trazer para cá, junto com a minha equipe, conteúdos nas próximas semanas e meses que vão te ajudar a evoluir exatamente nos pontos que vocês preencherem. O formulário é para que a gente consiga ajudar vocês de uma forma mais personalizada.</w:t>
+      </w:r>
+    </w:p>
+    <w:p>
+      <w:pPr>
+        <w:spacing w:after="160"/>
+      </w:pPr>
+      <w:r>
+        <w:rPr>
+          <w:sz w:val="21"/>
+          <w:szCs w:val="21"/>
+        </w:rPr>
+        <w:t xml:space="preserve">Preencham o formulário, vocês só têm a ganhar. Aproveitem muito o conteúdo aqui da nossa comunidade. Um abraço!"</w:t>
       </w:r>
     </w:p>
     <w:p>

</xml_diff>

<commit_message>
Separa o carrossel do portal (produzido pela Amanda) num documento próprio, com gancho revisado e seção de funcionalidades; simplifica automações do roteiro de vídeos para textos curtos no final do documento
Co-Authored-By: Claude Sonnet 5 <noreply@anthropic.com>
Claude-Session: https://claude.ai/code/session_01GQSqEjEuqv44iBdACeUWUZ
</commit_message>
<xml_diff>
--- a/eleva/roteiro-videos-hub-eleva-hub-negocios.docx
+++ b/eleva/roteiro-videos-hub-eleva-hub-negocios.docx
@@ -479,27 +479,6 @@
           <w:szCs w:val="21"/>
         </w:rPr>
         <w:t xml:space="preserve"> "Clica no link e entra para a comunidade"</w:t>
-      </w:r>
-    </w:p>
-    <w:p>
-      <w:pPr>
-        <w:spacing w:after="160"/>
-      </w:pPr>
-      <w:r>
-        <w:rPr>
-          <w:b/>
-          <w:bCs/>
-          <w:sz w:val="21"/>
-          <w:szCs w:val="21"/>
-        </w:rPr>
-        <w:t xml:space="preserve">Automação de direct (gatilho: comentário "COMUNIDADE"):</w:t>
-      </w:r>
-      <w:r>
-        <w:rPr>
-          <w:sz w:val="21"/>
-          <w:szCs w:val="21"/>
-        </w:rPr>
-        <w:t xml:space="preserve"> enviar o link de entrada da comunidade Eleva Síndicos de Alta Performance no WhatsApp.</w:t>
       </w:r>
     </w:p>
     <w:p>
@@ -992,528 +971,6 @@
           <w:szCs w:val="21"/>
         </w:rPr>
         <w:t xml:space="preserve">Comenta "Hub de Negócios" aqui embaixo que eu te mando no direct um formulário para você começar a receber esses conteúdos, e quem sabe fazer parte do nosso Hub de Parceiros. 👇</w:t>
-      </w:r>
-    </w:p>
-    <w:p>
-      <w:pPr>
-        <w:spacing w:after="80"/>
-      </w:pPr>
-      <w:r>
-        <w:rPr>
-          <w:i/>
-          <w:iCs/>
-          <w:color w:val="555555"/>
-          <w:sz w:val="18"/>
-          <w:szCs w:val="18"/>
-        </w:rPr>
-        <w:t xml:space="preserve">Automação de direct (gatilho: comentário "Hub de Negócios" no post do Vídeo 4):</w:t>
-      </w:r>
-    </w:p>
-    <w:p>
-      <w:pPr>
-        <w:pBdr>
-          <w:left w:val="single" w:color="cccccc" w:sz="12" w:space="8"/>
-        </w:pBdr>
-        <w:spacing w:after="120"/>
-        <w:ind w:left="400"/>
-      </w:pPr>
-      <w:r>
-        <w:rPr>
-          <w:i/>
-          <w:iCs/>
-          <w:color w:val="333333"/>
-          <w:sz w:val="20"/>
-          <w:szCs w:val="20"/>
-        </w:rPr>
-        <w:t xml:space="preserve">Oi, tudo bem? Vi aqui que você comentou "Hub de Negócios" e quero te trazer mais informações.</w:t>
-      </w:r>
-    </w:p>
-    <w:p>
-      <w:pPr>
-        <w:spacing w:after="160"/>
-      </w:pPr>
-      <w:r>
-        <w:rPr>
-          <w:sz w:val="21"/>
-          <w:szCs w:val="21"/>
-        </w:rPr>
-        <w:t xml:space="preserve">&gt;</w:t>
-      </w:r>
-    </w:p>
-    <w:p>
-      <w:pPr>
-        <w:pBdr>
-          <w:left w:val="single" w:color="cccccc" w:sz="12" w:space="8"/>
-        </w:pBdr>
-        <w:spacing w:after="120"/>
-        <w:ind w:left="400"/>
-      </w:pPr>
-      <w:r>
-        <w:rPr>
-          <w:i/>
-          <w:iCs/>
-          <w:color w:val="333333"/>
-          <w:sz w:val="20"/>
-          <w:szCs w:val="20"/>
-        </w:rPr>
-        <w:t xml:space="preserve">Clicando no link abaixo, você preenche seus dados e passa a receber conteúdos sobre esse tema direto no seu e-mail e WhatsApp. No mesmo formulário, você também pode mostrar interesse em fazer parte do nosso Hub de Parceiros, e assim construir junto com a gente essa rede de indicação e crescimento mútuo.</w:t>
-      </w:r>
-    </w:p>
-    <w:p>
-      <w:pPr>
-        <w:spacing w:after="160"/>
-      </w:pPr>
-      <w:r>
-        <w:rPr>
-          <w:sz w:val="21"/>
-          <w:szCs w:val="21"/>
-        </w:rPr>
-        <w:t xml:space="preserve">&gt;</w:t>
-      </w:r>
-    </w:p>
-    <w:p>
-      <w:pPr>
-        <w:pBdr>
-          <w:left w:val="single" w:color="cccccc" w:sz="12" w:space="8"/>
-        </w:pBdr>
-        <w:spacing w:after="120"/>
-        <w:ind w:left="400"/>
-      </w:pPr>
-      <w:r>
-        <w:rPr>
-          <w:i/>
-          <w:iCs/>
-          <w:color w:val="333333"/>
-          <w:sz w:val="20"/>
-          <w:szCs w:val="20"/>
-        </w:rPr>
-        <w:t xml:space="preserve">🔗 [link do formulário]</w:t>
-      </w:r>
-    </w:p>
-    <w:p>
-      <w:pPr>
-        <w:spacing w:after="160"/>
-      </w:pPr>
-      <w:r>
-        <w:rPr>
-          <w:sz w:val="21"/>
-          <w:szCs w:val="21"/>
-        </w:rPr>
-        <w:t xml:space="preserve">&gt;</w:t>
-      </w:r>
-    </w:p>
-    <w:p>
-      <w:pPr>
-        <w:pBdr>
-          <w:left w:val="single" w:color="cccccc" w:sz="12" w:space="8"/>
-        </w:pBdr>
-        <w:spacing w:after="120"/>
-        <w:ind w:left="400"/>
-      </w:pPr>
-      <w:r>
-        <w:rPr>
-          <w:i/>
-          <w:iCs/>
-          <w:color w:val="333333"/>
-          <w:sz w:val="20"/>
-          <w:szCs w:val="20"/>
-        </w:rPr>
-        <w:t xml:space="preserve">E se você é síndico, também deixo aqui o convite para participar da nossa comunidade, Eleva Síndicos de Alta Performance, no WhatsApp, uma comunidade gratuita com conteúdo semanal para o seu dia a dia de gestão.</w:t>
-      </w:r>
-    </w:p>
-    <w:p>
-      <w:pPr>
-        <w:spacing w:after="160"/>
-      </w:pPr>
-      <w:r>
-        <w:rPr>
-          <w:sz w:val="21"/>
-          <w:szCs w:val="21"/>
-        </w:rPr>
-        <w:t xml:space="preserve">&gt;</w:t>
-      </w:r>
-    </w:p>
-    <w:p>
-      <w:pPr>
-        <w:pBdr>
-          <w:left w:val="single" w:color="cccccc" w:sz="12" w:space="8"/>
-        </w:pBdr>
-        <w:spacing w:after="120"/>
-        <w:ind w:left="400"/>
-      </w:pPr>
-      <w:r>
-        <w:rPr>
-          <w:i/>
-          <w:iCs/>
-          <w:color w:val="333333"/>
-          <w:sz w:val="20"/>
-          <w:szCs w:val="20"/>
-        </w:rPr>
-        <w:t xml:space="preserve">🔗 [link do grupo do WhatsApp]</w:t>
-      </w:r>
-    </w:p>
-    <w:p>
-      <w:pPr>
-        <w:spacing w:after="160"/>
-      </w:pPr>
-      <w:r>
-        <w:rPr>
-          <w:sz w:val="21"/>
-          <w:szCs w:val="21"/>
-        </w:rPr>
-        <w:t xml:space="preserve">&gt;</w:t>
-      </w:r>
-    </w:p>
-    <w:p>
-      <w:pPr>
-        <w:pBdr>
-          <w:left w:val="single" w:color="cccccc" w:sz="12" w:space="8"/>
-        </w:pBdr>
-        <w:spacing w:after="120"/>
-        <w:ind w:left="400"/>
-      </w:pPr>
-      <w:r>
-        <w:rPr>
-          <w:i/>
-          <w:iCs/>
-          <w:color w:val="333333"/>
-          <w:sz w:val="20"/>
-          <w:szCs w:val="20"/>
-        </w:rPr>
-        <w:t xml:space="preserve">Qualquer dúvida, é só me chamar por aqui!</w:t>
-      </w:r>
-    </w:p>
-    <w:p>
-      <w:pPr>
-        <w:pBdr>
-          <w:bottom w:val="single" w:color="cccccc" w:sz="6" w:space="4"/>
-        </w:pBdr>
-        <w:spacing w:after="200"/>
-      </w:pPr>
-    </w:p>
-    <w:p>
-      <w:pPr>
-        <w:pStyle w:val="Heading2"/>
-        <w:keepNext/>
-        <w:spacing w:after="150" w:before="300"/>
-      </w:pPr>
-      <w:r>
-        <w:t xml:space="preserve">Carrossel — Lançamento do Portal do Síndico (Instagram)</w:t>
-      </w:r>
-    </w:p>
-    <w:p>
-      <w:pPr>
-        <w:spacing w:after="160"/>
-      </w:pPr>
-      <w:r>
-        <w:rPr>
-          <w:b/>
-          <w:bCs/>
-          <w:sz w:val="21"/>
-          <w:szCs w:val="21"/>
-        </w:rPr>
-        <w:t xml:space="preserve">Onde postar:</w:t>
-      </w:r>
-      <w:r>
-        <w:rPr>
-          <w:sz w:val="21"/>
-          <w:szCs w:val="21"/>
-        </w:rPr>
-        <w:t xml:space="preserve"> Instagram, carrossel</w:t>
-      </w:r>
-    </w:p>
-    <w:p>
-      <w:pPr>
-        <w:spacing w:after="160"/>
-      </w:pPr>
-      <w:r>
-        <w:rPr>
-          <w:b/>
-          <w:bCs/>
-          <w:sz w:val="21"/>
-          <w:szCs w:val="21"/>
-        </w:rPr>
-        <w:t xml:space="preserve">Estrutura:</w:t>
-      </w:r>
-      <w:r>
-        <w:rPr>
-          <w:sz w:val="21"/>
-          <w:szCs w:val="21"/>
-        </w:rPr>
-        <w:t xml:space="preserve"> gancho/headline que atrai → desenvolve a ideia gerando identificação → mostra a solução (o portal) → avisa que está em lançamento, com CTA</w:t>
-      </w:r>
-    </w:p>
-    <w:p>
-      <w:pPr>
-        <w:spacing w:after="80"/>
-      </w:pPr>
-      <w:r>
-        <w:rPr>
-          <w:i/>
-          <w:iCs/>
-          <w:color w:val="555555"/>
-          <w:sz w:val="18"/>
-          <w:szCs w:val="18"/>
-        </w:rPr>
-        <w:t xml:space="preserve">Slide 1 — Gancho:</w:t>
-      </w:r>
-    </w:p>
-    <w:p>
-      <w:pPr>
-        <w:spacing w:after="160"/>
-      </w:pPr>
-      <w:r>
-        <w:rPr>
-          <w:sz w:val="21"/>
-          <w:szCs w:val="21"/>
-        </w:rPr>
-        <w:t xml:space="preserve">"O síndico que mais cresce não é o que trabalha mais. É o que tem menos coisa passando pela cabeça dele."</w:t>
-      </w:r>
-    </w:p>
-    <w:p>
-      <w:pPr>
-        <w:spacing w:after="80"/>
-      </w:pPr>
-      <w:r>
-        <w:rPr>
-          <w:i/>
-          <w:iCs/>
-          <w:color w:val="555555"/>
-          <w:sz w:val="18"/>
-          <w:szCs w:val="18"/>
-        </w:rPr>
-        <w:t xml:space="preserve">Slide 2 — Identificação:</w:t>
-      </w:r>
-    </w:p>
-    <w:p>
-      <w:pPr>
-        <w:spacing w:after="160"/>
-      </w:pPr>
-      <w:r>
-        <w:rPr>
-          <w:sz w:val="21"/>
-          <w:szCs w:val="21"/>
-        </w:rPr>
-        <w:t xml:space="preserve">"Prestação de contas, assembleia, conselho, administradora, cada um puxando pra um lado, e tudo dependendo da sua memória e das suas planilhas."</w:t>
-      </w:r>
-    </w:p>
-    <w:p>
-      <w:pPr>
-        <w:spacing w:after="80"/>
-      </w:pPr>
-      <w:r>
-        <w:rPr>
-          <w:i/>
-          <w:iCs/>
-          <w:color w:val="555555"/>
-          <w:sz w:val="18"/>
-          <w:szCs w:val="18"/>
-        </w:rPr>
-        <w:t xml:space="preserve">Slide 3 — Identificação (continuação):</w:t>
-      </w:r>
-    </w:p>
-    <w:p>
-      <w:pPr>
-        <w:spacing w:after="160"/>
-      </w:pPr>
-      <w:r>
-        <w:rPr>
-          <w:sz w:val="21"/>
-          <w:szCs w:val="21"/>
-        </w:rPr>
-        <w:t xml:space="preserve">"E quando alguma coisa passa batido, quem segura a cobrança é você."</w:t>
-      </w:r>
-    </w:p>
-    <w:p>
-      <w:pPr>
-        <w:spacing w:after="80"/>
-      </w:pPr>
-      <w:r>
-        <w:rPr>
-          <w:i/>
-          <w:iCs/>
-          <w:color w:val="555555"/>
-          <w:sz w:val="18"/>
-          <w:szCs w:val="18"/>
-        </w:rPr>
-        <w:t xml:space="preserve">Slide 4 — Ponte para a solução:</w:t>
-      </w:r>
-    </w:p>
-    <w:p>
-      <w:pPr>
-        <w:spacing w:after="160"/>
-      </w:pPr>
-      <w:r>
-        <w:rPr>
-          <w:sz w:val="21"/>
-          <w:szCs w:val="21"/>
-        </w:rPr>
-        <w:t xml:space="preserve">"E se existisse um lugar só, pensado especificamente para a rotina do síndico, que organiza tudo isso?"</w:t>
-      </w:r>
-    </w:p>
-    <w:p>
-      <w:pPr>
-        <w:spacing w:after="80"/>
-      </w:pPr>
-      <w:r>
-        <w:rPr>
-          <w:i/>
-          <w:iCs/>
-          <w:color w:val="555555"/>
-          <w:sz w:val="18"/>
-          <w:szCs w:val="18"/>
-        </w:rPr>
-        <w:t xml:space="preserve">Slide 5 — Solução:</w:t>
-      </w:r>
-    </w:p>
-    <w:p>
-      <w:pPr>
-        <w:spacing w:after="160"/>
-      </w:pPr>
-      <w:r>
-        <w:rPr>
-          <w:sz w:val="21"/>
-          <w:szCs w:val="21"/>
-        </w:rPr>
-        <w:t xml:space="preserve">"Estamos desenvolvendo o Portal do Síndico da Eleva. Feito para facilitar a sua gestão, a sua prestação de contas, as suas assembleias e a sua relação com conselheiros e administradoras."</w:t>
-      </w:r>
-    </w:p>
-    <w:p>
-      <w:pPr>
-        <w:spacing w:after="80"/>
-      </w:pPr>
-      <w:r>
-        <w:rPr>
-          <w:i/>
-          <w:iCs/>
-          <w:color w:val="555555"/>
-          <w:sz w:val="18"/>
-          <w:szCs w:val="18"/>
-        </w:rPr>
-        <w:t xml:space="preserve">Slide 6 — Lançamento:</w:t>
-      </w:r>
-    </w:p>
-    <w:p>
-      <w:pPr>
-        <w:spacing w:after="160"/>
-      </w:pPr>
-      <w:r>
-        <w:rPr>
-          <w:sz w:val="21"/>
-          <w:szCs w:val="21"/>
-        </w:rPr>
-        <w:t xml:space="preserve">"Já estamos em fase de lançamento, com período gratuito para você testar."</w:t>
-      </w:r>
-    </w:p>
-    <w:p>
-      <w:pPr>
-        <w:spacing w:after="80"/>
-      </w:pPr>
-      <w:r>
-        <w:rPr>
-          <w:i/>
-          <w:iCs/>
-          <w:color w:val="555555"/>
-          <w:sz w:val="18"/>
-          <w:szCs w:val="18"/>
-        </w:rPr>
-        <w:t xml:space="preserve">Slide 7 — CTA:</w:t>
-      </w:r>
-    </w:p>
-    <w:p>
-      <w:pPr>
-        <w:spacing w:after="160"/>
-      </w:pPr>
-      <w:r>
-        <w:rPr>
-          <w:sz w:val="21"/>
-          <w:szCs w:val="21"/>
-        </w:rPr>
-        <w:t xml:space="preserve">"Comenta 'PORTAL' que eu te mando todas as informações no direct, ou se preferir, acessa pelo link da bio."</w:t>
-      </w:r>
-    </w:p>
-    <w:p>
-      <w:pPr>
-        <w:spacing w:after="80"/>
-      </w:pPr>
-      <w:r>
-        <w:rPr>
-          <w:i/>
-          <w:iCs/>
-          <w:color w:val="555555"/>
-          <w:sz w:val="18"/>
-          <w:szCs w:val="18"/>
-        </w:rPr>
-        <w:t xml:space="preserve">Legenda do post:</w:t>
-      </w:r>
-    </w:p>
-    <w:p>
-      <w:pPr>
-        <w:spacing w:after="160"/>
-      </w:pPr>
-      <w:r>
-        <w:rPr>
-          <w:sz w:val="21"/>
-          <w:szCs w:val="21"/>
-        </w:rPr>
-        <w:t xml:space="preserve">O síndico que mais cresce não é o que trabalha mais, é o que tem menos coisa passando pela cabeça dele.</w:t>
-      </w:r>
-    </w:p>
-    <w:p>
-      <w:pPr>
-        <w:spacing w:after="160"/>
-      </w:pPr>
-      <w:r>
-        <w:rPr>
-          <w:sz w:val="21"/>
-          <w:szCs w:val="21"/>
-        </w:rPr>
-        <w:t xml:space="preserve">Prestação de contas, assembleia, conselho, administradora, cada um puxando pra um lado, tudo dependendo da sua memória. E quando algo passa batido, quem segura a cobrança é você.</w:t>
-      </w:r>
-    </w:p>
-    <w:p>
-      <w:pPr>
-        <w:spacing w:after="160"/>
-      </w:pPr>
-      <w:r>
-        <w:rPr>
-          <w:sz w:val="21"/>
-          <w:szCs w:val="21"/>
-        </w:rPr>
-        <w:t xml:space="preserve">Estamos lançando o Portal do Síndico da Eleva, feito para facilitar sua gestão, sua prestação de contas, suas assembleias e sua relação com conselheiros e administradoras. Com período gratuito para testar.</w:t>
-      </w:r>
-    </w:p>
-    <w:p>
-      <w:pPr>
-        <w:spacing w:after="160"/>
-      </w:pPr>
-      <w:r>
-        <w:rPr>
-          <w:sz w:val="21"/>
-          <w:szCs w:val="21"/>
-        </w:rPr>
-        <w:t xml:space="preserve">Comenta "PORTAL" 👇 ou acessa pelo link da bio.</w:t>
-      </w:r>
-    </w:p>
-    <w:p>
-      <w:pPr>
-        <w:spacing w:after="160"/>
-      </w:pPr>
-      <w:r>
-        <w:rPr>
-          <w:b/>
-          <w:bCs/>
-          <w:sz w:val="21"/>
-          <w:szCs w:val="21"/>
-        </w:rPr>
-        <w:t xml:space="preserve">Automação de direct (gatilho: comentário "PORTAL"):</w:t>
-      </w:r>
-      <w:r>
-        <w:rPr>
-          <w:sz w:val="21"/>
-          <w:szCs w:val="21"/>
-        </w:rPr>
-        <w:t xml:space="preserve"> enviar todas as informações sobre o Portal do Síndico e o período de teste gratuito, com destaque para o acesso estendido de quem for parceiro do Hub de Negócios.</w:t>
       </w:r>
     </w:p>
     <w:p>
@@ -1819,64 +1276,147 @@
           </w:p>
         </w:tc>
       </w:tr>
-      <w:tr>
-        <w:tc>
-          <w:tcPr>
-            <w:tcW w:type="dxa" w:w="3008"/>
-          </w:tcPr>
-          <w:p>
-            <w:r>
-              <w:rPr>
-                <w:b w:val="false"/>
-                <w:bCs w:val="false"/>
-                <w:color w:val="000000"/>
-                <w:sz w:val="19"/>
-                <w:szCs w:val="19"/>
-              </w:rPr>
-              <w:t xml:space="preserve">Carrossel</w:t>
-            </w:r>
-          </w:p>
-        </w:tc>
-        <w:tc>
-          <w:tcPr>
-            <w:tcW w:type="dxa" w:w="3008"/>
-          </w:tcPr>
-          <w:p>
-            <w:r>
-              <w:rPr>
-                <w:b w:val="false"/>
-                <w:bCs w:val="false"/>
-                <w:color w:val="000000"/>
-                <w:sz w:val="19"/>
-                <w:szCs w:val="19"/>
-              </w:rPr>
-              <w:t xml:space="preserve">Instagram</w:t>
-            </w:r>
-          </w:p>
-        </w:tc>
-        <w:tc>
-          <w:tcPr>
-            <w:tcW w:type="dxa" w:w="3008"/>
-          </w:tcPr>
-          <w:p>
-            <w:r>
-              <w:rPr>
-                <w:b w:val="false"/>
-                <w:bCs w:val="false"/>
-                <w:color w:val="000000"/>
-                <w:sz w:val="19"/>
-                <w:szCs w:val="19"/>
-              </w:rPr>
-              <w:t xml:space="preserve">Carrossel, 7 slides</w:t>
-            </w:r>
-          </w:p>
-        </w:tc>
-      </w:tr>
     </w:tbl>
     <w:p>
       <w:pPr>
         <w:spacing w:after="160"/>
       </w:pPr>
+    </w:p>
+    <w:p>
+      <w:pPr>
+        <w:pBdr>
+          <w:bottom w:val="single" w:color="cccccc" w:sz="6" w:space="4"/>
+        </w:pBdr>
+        <w:spacing w:after="200"/>
+      </w:pPr>
+    </w:p>
+    <w:p>
+      <w:pPr>
+        <w:pStyle w:val="Heading2"/>
+        <w:keepNext/>
+        <w:spacing w:after="150" w:before="300"/>
+      </w:pPr>
+      <w:r>
+        <w:t xml:space="preserve">Automações</w:t>
+      </w:r>
+    </w:p>
+    <w:p>
+      <w:pPr>
+        <w:spacing w:after="160"/>
+      </w:pPr>
+      <w:r>
+        <w:rPr>
+          <w:sz w:val="21"/>
+          <w:szCs w:val="21"/>
+        </w:rPr>
+        <w:t xml:space="preserve">Textos curtos e diretos: a pessoa clica no botão, vai para a página, preenche o formulário. Para o Giuliano entender o que será configurado em cada automação.</w:t>
+      </w:r>
+    </w:p>
+    <w:p>
+      <w:pPr>
+        <w:spacing w:after="80"/>
+      </w:pPr>
+      <w:r>
+        <w:rPr>
+          <w:i/>
+          <w:iCs/>
+          <w:color w:val="555555"/>
+          <w:sz w:val="18"/>
+          <w:szCs w:val="18"/>
+        </w:rPr>
+        <w:t xml:space="preserve">Vídeo 2 — gatilho: comentário "COMUNIDADE"</w:t>
+      </w:r>
+    </w:p>
+    <w:p>
+      <w:pPr>
+        <w:pBdr>
+          <w:left w:val="single" w:color="cccccc" w:sz="12" w:space="8"/>
+        </w:pBdr>
+        <w:spacing w:after="120"/>
+        <w:ind w:left="400"/>
+      </w:pPr>
+      <w:r>
+        <w:rPr>
+          <w:i/>
+          <w:iCs/>
+          <w:color w:val="333333"/>
+          <w:sz w:val="20"/>
+          <w:szCs w:val="20"/>
+        </w:rPr>
+        <w:t xml:space="preserve">Oi! Aqui está o link para entrar na nossa comunidade:</w:t>
+      </w:r>
+    </w:p>
+    <w:p>
+      <w:pPr>
+        <w:pBdr>
+          <w:left w:val="single" w:color="cccccc" w:sz="12" w:space="8"/>
+        </w:pBdr>
+        <w:spacing w:after="120"/>
+        <w:ind w:left="400"/>
+      </w:pPr>
+      <w:r>
+        <w:rPr>
+          <w:i/>
+          <w:iCs/>
+          <w:color w:val="333333"/>
+          <w:sz w:val="20"/>
+          <w:szCs w:val="20"/>
+        </w:rPr>
+        <w:t xml:space="preserve">🔗 [link do grupo do WhatsApp]</w:t>
+      </w:r>
+    </w:p>
+    <w:p>
+      <w:pPr>
+        <w:spacing w:after="80"/>
+      </w:pPr>
+      <w:r>
+        <w:rPr>
+          <w:i/>
+          <w:iCs/>
+          <w:color w:val="555555"/>
+          <w:sz w:val="18"/>
+          <w:szCs w:val="18"/>
+        </w:rPr>
+        <w:t xml:space="preserve">Vídeo 4 — gatilho: comentário "Hub de Negócios"</w:t>
+      </w:r>
+    </w:p>
+    <w:p>
+      <w:pPr>
+        <w:pBdr>
+          <w:left w:val="single" w:color="cccccc" w:sz="12" w:space="8"/>
+        </w:pBdr>
+        <w:spacing w:after="120"/>
+        <w:ind w:left="400"/>
+      </w:pPr>
+      <w:r>
+        <w:rPr>
+          <w:i/>
+          <w:iCs/>
+          <w:color w:val="333333"/>
+          <w:sz w:val="20"/>
+          <w:szCs w:val="20"/>
+        </w:rPr>
+        <w:t xml:space="preserve">Oi! Aqui está o link para você se cadastrar e saber mais sobre o Hub de Negócios:</w:t>
+      </w:r>
+    </w:p>
+    <w:p>
+      <w:pPr>
+        <w:pBdr>
+          <w:left w:val="single" w:color="cccccc" w:sz="12" w:space="8"/>
+        </w:pBdr>
+        <w:spacing w:after="120"/>
+        <w:ind w:left="400"/>
+      </w:pPr>
+      <w:r>
+        <w:rPr>
+          <w:i/>
+          <w:iCs/>
+          <w:color w:val="333333"/>
+          <w:sz w:val="20"/>
+          <w:szCs w:val="20"/>
+        </w:rPr>
+        <w:t xml:space="preserve">🔗 [link do formulário]</w:t>
+      </w:r>
     </w:p>
     <w:sectPr>
       <w:pgSz w:w="11906" w:h="16838" w:orient="portrait"/>

</xml_diff>

<commit_message>
Adiciona coluna de automação na tabela resumo e deixa os textos de automação um pouco menos secos
Co-Authored-By: Claude Sonnet 5 <noreply@anthropic.com>
Claude-Session: https://claude.ai/code/session_01GQSqEjEuqv44iBdACeUWUZ
</commit_message>
<xml_diff>
--- a/eleva/roteiro-videos-hub-eleva-hub-negocios.docx
+++ b/eleva/roteiro-videos-hub-eleva-hub-negocios.docx
@@ -1004,14 +1004,15 @@
         </w:tblBorders>
       </w:tblPr>
       <w:tblGrid>
-        <w:gridCol w:w="3008"/>
-        <w:gridCol w:w="3008"/>
-        <w:gridCol w:w="3008"/>
+        <w:gridCol w:w="2256"/>
+        <w:gridCol w:w="2256"/>
+        <w:gridCol w:w="2256"/>
+        <w:gridCol w:w="2256"/>
       </w:tblGrid>
       <w:tr>
         <w:tc>
           <w:tcPr>
-            <w:tcW w:type="dxa" w:w="3008"/>
+            <w:tcW w:type="dxa" w:w="2256"/>
             <w:shd w:fill="1c2b4a" w:val="clear"/>
           </w:tcPr>
           <w:p>
@@ -1029,7 +1030,7 @@
         </w:tc>
         <w:tc>
           <w:tcPr>
-            <w:tcW w:type="dxa" w:w="3008"/>
+            <w:tcW w:type="dxa" w:w="2256"/>
             <w:shd w:fill="1c2b4a" w:val="clear"/>
           </w:tcPr>
           <w:p>
@@ -1047,7 +1048,7 @@
         </w:tc>
         <w:tc>
           <w:tcPr>
-            <w:tcW w:type="dxa" w:w="3008"/>
+            <w:tcW w:type="dxa" w:w="2256"/>
             <w:shd w:fill="1c2b4a" w:val="clear"/>
           </w:tcPr>
           <w:p>
@@ -1063,11 +1064,29 @@
             </w:r>
           </w:p>
         </w:tc>
+        <w:tc>
+          <w:tcPr>
+            <w:tcW w:type="dxa" w:w="2256"/>
+            <w:shd w:fill="1c2b4a" w:val="clear"/>
+          </w:tcPr>
+          <w:p>
+            <w:r>
+              <w:rPr>
+                <w:b/>
+                <w:bCs/>
+                <w:color w:val="FFFFFF"/>
+                <w:sz w:val="19"/>
+                <w:szCs w:val="19"/>
+              </w:rPr>
+              <w:t xml:space="preserve">Automação</w:t>
+            </w:r>
+          </w:p>
+        </w:tc>
       </w:tr>
       <w:tr>
         <w:tc>
           <w:tcPr>
-            <w:tcW w:type="dxa" w:w="3008"/>
+            <w:tcW w:type="dxa" w:w="2256"/>
           </w:tcPr>
           <w:p>
             <w:r>
@@ -1084,7 +1103,7 @@
         </w:tc>
         <w:tc>
           <w:tcPr>
-            <w:tcW w:type="dxa" w:w="3008"/>
+            <w:tcW w:type="dxa" w:w="2256"/>
           </w:tcPr>
           <w:p>
             <w:r>
@@ -1101,7 +1120,7 @@
         </w:tc>
         <w:tc>
           <w:tcPr>
-            <w:tcW w:type="dxa" w:w="3008"/>
+            <w:tcW w:type="dxa" w:w="2256"/>
           </w:tcPr>
           <w:p>
             <w:r>
@@ -1116,11 +1135,28 @@
             </w:r>
           </w:p>
         </w:tc>
+        <w:tc>
+          <w:tcPr>
+            <w:tcW w:type="dxa" w:w="2256"/>
+          </w:tcPr>
+          <w:p>
+            <w:r>
+              <w:rPr>
+                <w:b w:val="false"/>
+                <w:bCs w:val="false"/>
+                <w:color w:val="000000"/>
+                <w:sz w:val="19"/>
+                <w:szCs w:val="19"/>
+              </w:rPr>
+              <w:t xml:space="preserve">Não, link direto no vídeo</w:t>
+            </w:r>
+          </w:p>
+        </w:tc>
       </w:tr>
       <w:tr>
         <w:tc>
           <w:tcPr>
-            <w:tcW w:type="dxa" w:w="3008"/>
+            <w:tcW w:type="dxa" w:w="2256"/>
           </w:tcPr>
           <w:p>
             <w:r>
@@ -1137,7 +1173,7 @@
         </w:tc>
         <w:tc>
           <w:tcPr>
-            <w:tcW w:type="dxa" w:w="3008"/>
+            <w:tcW w:type="dxa" w:w="2256"/>
           </w:tcPr>
           <w:p>
             <w:r>
@@ -1154,7 +1190,7 @@
         </w:tc>
         <w:tc>
           <w:tcPr>
-            <w:tcW w:type="dxa" w:w="3008"/>
+            <w:tcW w:type="dxa" w:w="2256"/>
           </w:tcPr>
           <w:p>
             <w:r>
@@ -1169,11 +1205,28 @@
             </w:r>
           </w:p>
         </w:tc>
+        <w:tc>
+          <w:tcPr>
+            <w:tcW w:type="dxa" w:w="2256"/>
+          </w:tcPr>
+          <w:p>
+            <w:r>
+              <w:rPr>
+                <w:b w:val="false"/>
+                <w:bCs w:val="false"/>
+                <w:color w:val="000000"/>
+                <w:sz w:val="19"/>
+                <w:szCs w:val="19"/>
+              </w:rPr>
+              <w:t xml:space="preserve">Sim, gatilho "COMUNIDADE"</w:t>
+            </w:r>
+          </w:p>
+        </w:tc>
       </w:tr>
       <w:tr>
         <w:tc>
           <w:tcPr>
-            <w:tcW w:type="dxa" w:w="3008"/>
+            <w:tcW w:type="dxa" w:w="2256"/>
           </w:tcPr>
           <w:p>
             <w:r>
@@ -1190,7 +1243,7 @@
         </w:tc>
         <w:tc>
           <w:tcPr>
-            <w:tcW w:type="dxa" w:w="3008"/>
+            <w:tcW w:type="dxa" w:w="2256"/>
           </w:tcPr>
           <w:p>
             <w:r>
@@ -1207,7 +1260,7 @@
         </w:tc>
         <w:tc>
           <w:tcPr>
-            <w:tcW w:type="dxa" w:w="3008"/>
+            <w:tcW w:type="dxa" w:w="2256"/>
           </w:tcPr>
           <w:p>
             <w:r>
@@ -1222,11 +1275,28 @@
             </w:r>
           </w:p>
         </w:tc>
+        <w:tc>
+          <w:tcPr>
+            <w:tcW w:type="dxa" w:w="2256"/>
+          </w:tcPr>
+          <w:p>
+            <w:r>
+              <w:rPr>
+                <w:b w:val="false"/>
+                <w:bCs w:val="false"/>
+                <w:color w:val="000000"/>
+                <w:sz w:val="19"/>
+                <w:szCs w:val="19"/>
+              </w:rPr>
+              <w:t xml:space="preserve">Não, link do formulário direto no grupo</w:t>
+            </w:r>
+          </w:p>
+        </w:tc>
       </w:tr>
       <w:tr>
         <w:tc>
           <w:tcPr>
-            <w:tcW w:type="dxa" w:w="3008"/>
+            <w:tcW w:type="dxa" w:w="2256"/>
           </w:tcPr>
           <w:p>
             <w:r>
@@ -1243,7 +1313,7 @@
         </w:tc>
         <w:tc>
           <w:tcPr>
-            <w:tcW w:type="dxa" w:w="3008"/>
+            <w:tcW w:type="dxa" w:w="2256"/>
           </w:tcPr>
           <w:p>
             <w:r>
@@ -1260,7 +1330,7 @@
         </w:tc>
         <w:tc>
           <w:tcPr>
-            <w:tcW w:type="dxa" w:w="3008"/>
+            <w:tcW w:type="dxa" w:w="2256"/>
           </w:tcPr>
           <w:p>
             <w:r>
@@ -1275,6 +1345,23 @@
             </w:r>
           </w:p>
         </w:tc>
+        <w:tc>
+          <w:tcPr>
+            <w:tcW w:type="dxa" w:w="2256"/>
+          </w:tcPr>
+          <w:p>
+            <w:r>
+              <w:rPr>
+                <w:b w:val="false"/>
+                <w:bCs w:val="false"/>
+                <w:color w:val="000000"/>
+                <w:sz w:val="19"/>
+                <w:szCs w:val="19"/>
+              </w:rPr>
+              <w:t xml:space="preserve">Sim, gatilho "Hub de Negócios"</w:t>
+            </w:r>
+          </w:p>
+        </w:tc>
       </w:tr>
     </w:tbl>
     <w:p>
@@ -1343,7 +1430,7 @@
           <w:sz w:val="20"/>
           <w:szCs w:val="20"/>
         </w:rPr>
-        <w:t xml:space="preserve">Oi! Aqui está o link para entrar na nossa comunidade:</w:t>
+        <w:t xml:space="preserve">Oi, tudo bem? Que bom que você quer fazer parte! Aqui está o link para entrar na nossa comunidade:</w:t>
       </w:r>
     </w:p>
     <w:p>
@@ -1396,7 +1483,7 @@
           <w:sz w:val="20"/>
           <w:szCs w:val="20"/>
         </w:rPr>
-        <w:t xml:space="preserve">Oi! Aqui está o link para você se cadastrar e saber mais sobre o Hub de Negócios:</w:t>
+        <w:t xml:space="preserve">Oi, tudo bem? Vi seu interesse no Hub de Negócios. Aqui está o link para você se cadastrar e saber mais:</w:t>
       </w:r>
     </w:p>
     <w:p>

</xml_diff>

<commit_message>
Atualiza textos finais das automações dos vídeos 2 e 4
Co-Authored-By: Claude Sonnet 5 <noreply@anthropic.com>
Claude-Session: https://claude.ai/code/session_01GQSqEjEuqv44iBdACeUWUZ
</commit_message>
<xml_diff>
--- a/eleva/roteiro-videos-hub-eleva-hub-negocios.docx
+++ b/eleva/roteiro-videos-hub-eleva-hub-negocios.docx
@@ -1430,7 +1430,7 @@
           <w:sz w:val="20"/>
           <w:szCs w:val="20"/>
         </w:rPr>
-        <w:t xml:space="preserve">Oi, tudo bem? Que bom que você quer fazer parte! Aqui está o link para entrar na nossa comunidade:</w:t>
+        <w:t xml:space="preserve">Oi, [nome], tudo bem? Que bom que você quer fazer parte da comunidade Eleva lá no WhatsApp. Para participar, basta clicar no link abaixo. Nos vemos na comunidade. Um abraço!</w:t>
       </w:r>
     </w:p>
     <w:p>
@@ -1483,7 +1483,7 @@
           <w:sz w:val="20"/>
           <w:szCs w:val="20"/>
         </w:rPr>
-        <w:t xml:space="preserve">Oi, tudo bem? Vi seu interesse no Hub de Negócios. Aqui está o link para você se cadastrar e saber mais:</w:t>
+        <w:t xml:space="preserve">Oi, [nome], tudo bem? Que bom que você se interessou em saber mais e quem sabe participar do nosso Hub de Negócios. Toque no link abaixo para saber mais informações e aplicar para fazer parte do Hub, caso você deseje. Um abraço!</w:t>
       </w:r>
     </w:p>
     <w:p>

</xml_diff>

<commit_message>
Adiciona texto pronto da mensagem de agradecimento (item 9) do formulário do Vídeo 3
Co-Authored-By: Claude Sonnet 5 <noreply@anthropic.com>
Claude-Session: https://claude.ai/code/session_01GQSqEjEuqv44iBdACeUWUZ
</commit_message>
<xml_diff>
--- a/eleva/roteiro-videos-hub-eleva-hub-negocios.docx
+++ b/eleva/roteiro-videos-hub-eleva-hub-negocios.docx
@@ -832,7 +832,26 @@
           <w:sz w:val="21"/>
           <w:szCs w:val="21"/>
         </w:rPr>
-        <w:t xml:space="preserve">9. Mensagem final: agradecimento, avisando que nos próximos dias a pessoa também vai ter acesso a novidades sobre o portal do síndico que a Eleva está desenvolvendo</w:t>
+        <w:t xml:space="preserve">9. Mensagem final (texto da tela de confirmação do Google Forms):</w:t>
+      </w:r>
+    </w:p>
+    <w:p>
+      <w:pPr>
+        <w:pBdr>
+          <w:left w:val="single" w:color="cccccc" w:sz="12" w:space="8"/>
+        </w:pBdr>
+        <w:spacing w:after="120"/>
+        <w:ind w:left="400"/>
+      </w:pPr>
+      <w:r>
+        <w:rPr>
+          <w:i/>
+          <w:iCs/>
+          <w:color w:val="333333"/>
+          <w:sz w:val="20"/>
+          <w:szCs w:val="20"/>
+        </w:rPr>
+        <w:t xml:space="preserve">Obrigado por responder! Suas respostas foram recebidas com muito carinho, e vamos usá-las para trazer conteúdos cada vez mais personalizados para você. Em breve, você também vai ter acesso a novidades sobre o portal do síndico que a Eleva está desenvolvendo.</w:t>
       </w:r>
     </w:p>
     <w:p>

</xml_diff>

<commit_message>
Adiciona link real do formulário do Google Forms no Vídeo 3
Co-Authored-By: Claude Sonnet 5 <noreply@anthropic.com>
Claude-Session: https://claude.ai/code/session_01GQSqEjEuqv44iBdACeUWUZ
</commit_message>
<xml_diff>
--- a/eleva/roteiro-videos-hub-eleva-hub-negocios.docx
+++ b/eleva/roteiro-videos-hub-eleva-hub-negocios.docx
@@ -679,7 +679,34 @@
           <w:sz w:val="18"/>
           <w:szCs w:val="18"/>
         </w:rPr>
-        <w:t xml:space="preserve">Logo abaixo, enviar o link do formulário (Google Forms) com os campos:</w:t>
+        <w:t xml:space="preserve">Logo abaixo, enviar o link do formulário (Google Forms):</w:t>
+      </w:r>
+    </w:p>
+    <w:p>
+      <w:pPr>
+        <w:spacing w:after="160"/>
+      </w:pPr>
+      <w:r>
+        <w:rPr>
+          <w:sz w:val="21"/>
+          <w:szCs w:val="21"/>
+        </w:rPr>
+        <w:t xml:space="preserve">🔗 https://forms.gle/6yViYCZwH3QtzgKEA</w:t>
+      </w:r>
+    </w:p>
+    <w:p>
+      <w:pPr>
+        <w:spacing w:after="80"/>
+      </w:pPr>
+      <w:r>
+        <w:rPr>
+          <w:i/>
+          <w:iCs/>
+          <w:color w:val="555555"/>
+          <w:sz w:val="18"/>
+          <w:szCs w:val="18"/>
+        </w:rPr>
+        <w:t xml:space="preserve">Campos do formulário:</w:t>
       </w:r>
     </w:p>
     <w:p>

</xml_diff>

<commit_message>
Adiciona espaçamento no roteiro do Vídeo 4 e sugestão de campos + mensagem final do formulário do Hub de Negócios
Co-Authored-By: Claude Sonnet 5 <noreply@anthropic.com>
Claude-Session: https://claude.ai/code/session_01GQSqEjEuqv44iBdACeUWUZ
</commit_message>
<xml_diff>
--- a/eleva/roteiro-videos-hub-eleva-hub-negocios.docx
+++ b/eleva/roteiro-videos-hub-eleva-hub-negocios.docx
@@ -965,7 +965,43 @@
           <w:sz w:val="21"/>
           <w:szCs w:val="21"/>
         </w:rPr>
-        <w:t xml:space="preserve">"Se você presta algum tipo de serviço para condomínio, seja como executivo, síndico ou prestador de serviço, entenda que estar rodeado de um hub de parceiros que te auxiliam nas diversas demandas do condomínio é uma das formas mais fáceis de você expandir a sua carteira, o seu relacionamento, criar network e entregar mais valor para os seus clientes. Assim, todo mundo constrói uma relação de ganha-ganha. Aqui na Eleva, dentro do guarda-chuva do Eleva Group, temos justamente o Hub de Negócios, onde desenvolvemos exatamente esses pontos. Se você se interessou, comenta aqui 'Hub de Negócios' que eu te mando no direct um formulário para você preencher e começar a receber esses conteúdos, e quem sabe até fazer parte do nosso Hub de Parceiros."</w:t>
+        <w:t xml:space="preserve">"Se você presta algum tipo de serviço para condomínio, seja como executivo, síndico ou prestador de serviço, entenda que estar rodeado de um hub de parceiros que te auxiliam nas diversas demandas do condomínio é uma das formas mais fáceis de você expandir a sua carteira, o seu relacionamento, criar network e entregar mais valor para os seus clientes.</w:t>
+      </w:r>
+    </w:p>
+    <w:p>
+      <w:pPr>
+        <w:spacing w:after="160"/>
+      </w:pPr>
+      <w:r>
+        <w:rPr>
+          <w:sz w:val="21"/>
+          <w:szCs w:val="21"/>
+        </w:rPr>
+        <w:t xml:space="preserve">Assim, todo mundo constrói uma relação de ganha-ganha.</w:t>
+      </w:r>
+    </w:p>
+    <w:p>
+      <w:pPr>
+        <w:spacing w:after="160"/>
+      </w:pPr>
+      <w:r>
+        <w:rPr>
+          <w:sz w:val="21"/>
+          <w:szCs w:val="21"/>
+        </w:rPr>
+        <w:t xml:space="preserve">Aqui na Eleva, dentro do guarda-chuva do Eleva Group, temos justamente o Hub de Negócios, onde desenvolvemos exatamente esses pontos.</w:t>
+      </w:r>
+    </w:p>
+    <w:p>
+      <w:pPr>
+        <w:spacing w:after="160"/>
+      </w:pPr>
+      <w:r>
+        <w:rPr>
+          <w:sz w:val="21"/>
+          <w:szCs w:val="21"/>
+        </w:rPr>
+        <w:t xml:space="preserve">Se você se interessou, comenta aqui 'Hub de Negócios' que eu te mando no direct um formulário para você preencher e começar a receber esses conteúdos, e quem sabe até fazer parte do nosso Hub de Parceiros."</w:t>
       </w:r>
     </w:p>
     <w:p>
@@ -1551,6 +1587,174 @@
         <w:t xml:space="preserve">🔗 [link do formulário]</w:t>
       </w:r>
     </w:p>
+    <w:p>
+      <w:pPr>
+        <w:spacing w:after="80"/>
+      </w:pPr>
+      <w:r>
+        <w:rPr>
+          <w:i/>
+          <w:iCs/>
+          <w:color w:val="555555"/>
+          <w:sz w:val="18"/>
+          <w:szCs w:val="18"/>
+        </w:rPr>
+        <w:t xml:space="preserve">Sugestão de campos para o formulário (Google Forms) do Hub de Negócios:</w:t>
+      </w:r>
+    </w:p>
+    <w:p>
+      <w:pPr>
+        <w:pStyle w:val="ListParagraph"/>
+        <w:numPr>
+          <w:ilvl w:val="0"/>
+          <w:numId w:val="2"/>
+        </w:numPr>
+        <w:spacing w:after="80"/>
+      </w:pPr>
+      <w:r>
+        <w:rPr>
+          <w:sz w:val="21"/>
+          <w:szCs w:val="21"/>
+        </w:rPr>
+        <w:t xml:space="preserve">1. Nome</w:t>
+      </w:r>
+    </w:p>
+    <w:p>
+      <w:pPr>
+        <w:pStyle w:val="ListParagraph"/>
+        <w:numPr>
+          <w:ilvl w:val="0"/>
+          <w:numId w:val="2"/>
+        </w:numPr>
+        <w:spacing w:after="80"/>
+      </w:pPr>
+      <w:r>
+        <w:rPr>
+          <w:sz w:val="21"/>
+          <w:szCs w:val="21"/>
+        </w:rPr>
+        <w:t xml:space="preserve">2. WhatsApp</w:t>
+      </w:r>
+    </w:p>
+    <w:p>
+      <w:pPr>
+        <w:pStyle w:val="ListParagraph"/>
+        <w:numPr>
+          <w:ilvl w:val="0"/>
+          <w:numId w:val="2"/>
+        </w:numPr>
+        <w:spacing w:after="80"/>
+      </w:pPr>
+      <w:r>
+        <w:rPr>
+          <w:sz w:val="21"/>
+          <w:szCs w:val="21"/>
+        </w:rPr>
+        <w:t xml:space="preserve">3. E-mail</w:t>
+      </w:r>
+    </w:p>
+    <w:p>
+      <w:pPr>
+        <w:pStyle w:val="ListParagraph"/>
+        <w:numPr>
+          <w:ilvl w:val="0"/>
+          <w:numId w:val="2"/>
+        </w:numPr>
+        <w:spacing w:after="80"/>
+      </w:pPr>
+      <w:r>
+        <w:rPr>
+          <w:sz w:val="21"/>
+          <w:szCs w:val="21"/>
+        </w:rPr>
+        <w:t xml:space="preserve">4. Você é: síndico / fornecedor ou prestador de serviço para condomínio / executivo de administradora</w:t>
+      </w:r>
+    </w:p>
+    <w:p>
+      <w:pPr>
+        <w:pStyle w:val="ListParagraph"/>
+        <w:numPr>
+          <w:ilvl w:val="0"/>
+          <w:numId w:val="2"/>
+        </w:numPr>
+        <w:spacing w:after="80"/>
+      </w:pPr>
+      <w:r>
+        <w:rPr>
+          <w:sz w:val="21"/>
+          <w:szCs w:val="21"/>
+        </w:rPr>
+        <w:t xml:space="preserve">5. Tem interesse em fazer parte de uma rede de network com relação ganha-ganha no ramo condominial?</w:t>
+      </w:r>
+    </w:p>
+    <w:p>
+      <w:pPr>
+        <w:pStyle w:val="ListParagraph"/>
+        <w:numPr>
+          <w:ilvl w:val="0"/>
+          <w:numId w:val="2"/>
+        </w:numPr>
+        <w:spacing w:after="80"/>
+      </w:pPr>
+      <w:r>
+        <w:rPr>
+          <w:sz w:val="21"/>
+          <w:szCs w:val="21"/>
+        </w:rPr>
+        <w:t xml:space="preserve">6. Tem interesse em ter vantagens e benefícios através dessa parceria?</w:t>
+      </w:r>
+    </w:p>
+    <w:p>
+      <w:pPr>
+        <w:pStyle w:val="ListParagraph"/>
+        <w:numPr>
+          <w:ilvl w:val="0"/>
+          <w:numId w:val="2"/>
+        </w:numPr>
+        <w:spacing w:after="80"/>
+      </w:pPr>
+      <w:r>
+        <w:rPr>
+          <w:sz w:val="21"/>
+          <w:szCs w:val="21"/>
+        </w:rPr>
+        <w:t xml:space="preserve">7. Aceita receber atualizações do mercado condominial, novidades e lançamentos da Eleva por e-mail e WhatsApp?</w:t>
+      </w:r>
+    </w:p>
+    <w:p>
+      <w:pPr>
+        <w:spacing w:after="80"/>
+      </w:pPr>
+      <w:r>
+        <w:rPr>
+          <w:i/>
+          <w:iCs/>
+          <w:color w:val="555555"/>
+          <w:sz w:val="18"/>
+          <w:szCs w:val="18"/>
+        </w:rPr>
+        <w:t xml:space="preserve">Mensagem final (texto da tela de confirmação):</w:t>
+      </w:r>
+    </w:p>
+    <w:p>
+      <w:pPr>
+        <w:pBdr>
+          <w:left w:val="single" w:color="cccccc" w:sz="12" w:space="8"/>
+        </w:pBdr>
+        <w:spacing w:after="120"/>
+        <w:ind w:left="400"/>
+      </w:pPr>
+      <w:r>
+        <w:rPr>
+          <w:i/>
+          <w:iCs/>
+          <w:color w:val="333333"/>
+          <w:sz w:val="20"/>
+          <w:szCs w:val="20"/>
+        </w:rPr>
+        <w:t xml:space="preserve">Obrigado por se cadastrar! Em breve, a nossa equipe entrará em contato por e-mail ou WhatsApp para trazer mais detalhes e explicar melhor sobre a parceria.</w:t>
+      </w:r>
+    </w:p>
     <w:sectPr>
       <w:pgSz w:w="11906" w:h="16838" w:orient="portrait"/>
       <w:pgMar w:top="1080" w:right="1080" w:bottom="1080" w:left="1080" w:header="708" w:footer="708" w:gutter="0"/>

</xml_diff>

<commit_message>
Adiciona título e descrição do Google Forms do Hub de Negócios
Co-Authored-By: Claude Sonnet 5 <noreply@anthropic.com>
Claude-Session: https://claude.ai/code/session_01GQSqEjEuqv44iBdACeUWUZ
</commit_message>
<xml_diff>
--- a/eleva/roteiro-videos-hub-eleva-hub-negocios.docx
+++ b/eleva/roteiro-videos-hub-eleva-hub-negocios.docx
@@ -1599,7 +1599,46 @@
           <w:sz w:val="18"/>
           <w:szCs w:val="18"/>
         </w:rPr>
-        <w:t xml:space="preserve">Sugestão de campos para o formulário (Google Forms) do Hub de Negócios:</w:t>
+        <w:t xml:space="preserve">Sugestão de título e descrição (Google Forms) do Hub de Negócios:</w:t>
+      </w:r>
+    </w:p>
+    <w:p>
+      <w:pPr>
+        <w:spacing w:after="160"/>
+      </w:pPr>
+      <w:r>
+        <w:rPr>
+          <w:sz w:val="21"/>
+          <w:szCs w:val="21"/>
+        </w:rPr>
+        <w:t xml:space="preserve">Título: "Hub de Negócios Eleva — Cadastro de Parceiros"</w:t>
+      </w:r>
+    </w:p>
+    <w:p>
+      <w:pPr>
+        <w:spacing w:after="160"/>
+      </w:pPr>
+      <w:r>
+        <w:rPr>
+          <w:sz w:val="21"/>
+          <w:szCs w:val="21"/>
+        </w:rPr>
+        <w:t xml:space="preserve">Descrição: "Preencha seus dados para saber mais sobre o Hub de Negócios da Eleva, uma rede de parceiros do ramo condominial com relação ganha-ganha. Leva menos de 2 minutos."</w:t>
+      </w:r>
+    </w:p>
+    <w:p>
+      <w:pPr>
+        <w:spacing w:after="80"/>
+      </w:pPr>
+      <w:r>
+        <w:rPr>
+          <w:i/>
+          <w:iCs/>
+          <w:color w:val="555555"/>
+          <w:sz w:val="18"/>
+          <w:szCs w:val="18"/>
+        </w:rPr>
+        <w:t xml:space="preserve">Campos do formulário:</w:t>
       </w:r>
     </w:p>
     <w:p>

</xml_diff>